<commit_message>
Exige TLS para la LAN y documenta certificados seguros
</commit_message>
<xml_diff>
--- a/Documentacion/Manual_de_Administracion_y_Operacion_PriceBot.docx
+++ b/Documentacion/Manual_de_Administracion_y_Operacion_PriceBot.docx
@@ -295,14 +295,8 @@
             <w:shd w:fill="EAF3F8"/>
           </w:tcPr>
           <w:p>
-            <w:pPr>
-              <w:spacing w:after="0"/>
-            </w:pPr>
             <w:r>
-              <w:rPr>
-                <w:sz w:val="19"/>
-              </w:rPr>
-              <w:t>6 de octubre de 2026</w:t>
+              <w:t>13 de octubre de 2026</w:t>
             </w:r>
           </w:p>
         </w:tc>
@@ -392,7 +386,7 @@
     </w:p>
     <w:p>
       <w:r>
-        <w:t>La instalación actual se publica dentro de la red local mediante HTTP en 192.168.190.146. La autenticación, los límites de carga y las validaciones de archivos están activos, pero HTTP no cifra credenciales ni documentos durante el tránsito. Para documentos confidenciales, la configuración objetivo debe ser HTTPS con un certificado confiable o acceso mediante VPN. Hasta completar ese cambio, el uso debe limitarse a una LAN privada y controlada.</w:t>
+        <w:t>El administrador opera desde la PC servidor mediante localhost. Para las demás computadoras, PriceBot exige HTTPS y un certificado TLS confiable. Sin certificado y clave configurados, el lanzador limita frontend y API a localhost; al instalarlos, habilita HTTPS en la LAN. No usar documentos ni credenciales remotas por HTTP.</w:t>
       </w:r>
     </w:p>
     <w:p>
@@ -576,18 +570,9 @@
             <w:vAlign w:val="center"/>
           </w:tcPr>
           <w:p>
-            <w:pPr>
-              <w:spacing w:after="0"/>
-            </w:pPr>
-            <w:hyperlink r:id="rId9">
-              <w:r>
-                <w:rPr>
-                  <w:color w:val="0563C1"/>
-                  <w:u w:val="single"/>
-                </w:rPr>
-                <w:t>http://127.0.0.1:3000</w:t>
-              </w:r>
-            </w:hyperlink>
+            <w:r>
+              <w:t>http://127.0.0.1:3000</w:t>
+            </w:r>
           </w:p>
         </w:tc>
         <w:tc>
@@ -602,13 +587,7 @@
             <w:vAlign w:val="center"/>
           </w:tcPr>
           <w:p>
-            <w:pPr>
-              <w:spacing w:after="0"/>
-            </w:pPr>
             <w:r>
-              <w:rPr>
-                <w:sz w:val="18"/>
-              </w:rPr>
               <w:t>Solo desde la PC servidor; acceso como Administrador local</w:t>
             </w:r>
           </w:p>
@@ -655,18 +634,9 @@
             <w:shd w:fill="EAF3F8"/>
           </w:tcPr>
           <w:p>
-            <w:pPr>
-              <w:spacing w:after="0"/>
-            </w:pPr>
-            <w:hyperlink r:id="rId10">
-              <w:r>
-                <w:rPr>
-                  <w:color w:val="0563C1"/>
-                  <w:u w:val="single"/>
-                </w:rPr>
-                <w:t>http://192.168.190.146:3000</w:t>
-              </w:r>
-            </w:hyperlink>
+            <w:r>
+              <w:t>https://192.168.190.146:3000</w:t>
+            </w:r>
           </w:p>
         </w:tc>
         <w:tc>
@@ -682,14 +652,8 @@
             <w:shd w:fill="EAF3F8"/>
           </w:tcPr>
           <w:p>
-            <w:pPr>
-              <w:spacing w:after="0"/>
-            </w:pPr>
             <w:r>
-              <w:rPr>
-                <w:sz w:val="18"/>
-              </w:rPr>
-              <w:t>Requiere correo confirmado y contraseña</w:t>
+              <w:t>HTTPS; requiere certificado confiable cuyo SAN incluya el nombre o IP</w:t>
             </w:r>
           </w:p>
         </w:tc>
@@ -733,18 +697,9 @@
             <w:vAlign w:val="center"/>
           </w:tcPr>
           <w:p>
-            <w:pPr>
-              <w:spacing w:after="0"/>
-            </w:pPr>
-            <w:hyperlink r:id="rId11">
-              <w:r>
-                <w:rPr>
-                  <w:color w:val="0563C1"/>
-                  <w:u w:val="single"/>
-                </w:rPr>
-                <w:t>http://192.168.190.146:8000/health</w:t>
-              </w:r>
-            </w:hyperlink>
+            <w:r>
+              <w:t>https://192.168.190.146:8000/health</w:t>
+            </w:r>
           </w:p>
         </w:tc>
         <w:tc>
@@ -759,14 +714,8 @@
             <w:vAlign w:val="center"/>
           </w:tcPr>
           <w:p>
-            <w:pPr>
-              <w:spacing w:after="0"/>
-            </w:pPr>
             <w:r>
-              <w:rPr>
-                <w:sz w:val="18"/>
-              </w:rPr>
-              <w:t>Diagnóstico; debe responder status ok</w:t>
+              <w:t>Diagnóstico HTTPS; debe responder status ok</w:t>
             </w:r>
           </w:p>
         </w:tc>
@@ -1243,6 +1192,102 @@
         </w:tc>
       </w:tr>
     </w:tbl>
+    <w:p>
+      <w:pPr>
+        <w:pStyle w:val="Heading2"/>
+      </w:pPr>
+      <w:r>
+        <w:t>Acceso según el perfil</w:t>
+      </w:r>
+    </w:p>
+    <w:p>
+      <w:pPr>
+        <w:spacing w:after="100"/>
+      </w:pPr>
+      <w:r>
+        <w:t>Administración: en la PC servidor, abrir http://127.0.0.1:3000 y entrar en Usuarios. El acceso local funciona como administrador sin contraseña de PriceBot; proteger la PC con una cuenta Windows individual, bloqueo automático y disco cifrado. La administración de usuarios se rechaza desde otras computadoras.</w:t>
+      </w:r>
+    </w:p>
+    <w:p>
+      <w:pPr>
+        <w:spacing w:after="100"/>
+      </w:pPr>
+      <w:r>
+        <w:t>Usuarios: cada persona debe ser creada por Administración con su correo y contraseña individual. Debe confirmar el correo y luego ingresar desde https://192.168.190.146:3000. No hay una cuenta ni contraseña compartida por defecto.</w:t>
+      </w:r>
+    </w:p>
+    <w:p>
+      <w:pPr>
+        <w:spacing w:after="100"/>
+      </w:pPr>
+      <w:r>
+        <w:t>Antes del primer acceso remoto, TI debe obtener e instalar un certificado TLS confiable que incluya en SAN el nombre DNS usado por las PCs (o la IP privada exacta si la CA interna emite para IP). El lanzador exige HTTPS y cookies seguras; sin certificado válido, los clientes deben rechazar la conexión.</w:t>
+      </w:r>
+    </w:p>
+    <w:p>
+      <w:pPr>
+        <w:spacing w:after="100"/>
+      </w:pPr>
+      <w:r>
+        <w:t>Permitir los puertos 3000 y 8000 en el firewall de Windows solo para el perfil Privado y la subred autorizada; no publicarlos directamente en Internet. hardening.ps1 configura 192.168.190.0/24. El diagnóstico de API usa https://192.168.190.146:8000/health.</w:t>
+      </w:r>
+    </w:p>
+    <w:p>
+      <w:pPr>
+        <w:spacing w:after="100"/>
+      </w:pPr>
+      <w:r>
+        <w:t>Para que lleguen las confirmaciones, el servidor debe tener SMTP de Gmail configurado en pricebot/.env y PRICEBOT_PUBLIC_URL debe coincidir con la URL HTTPS usada por las PCs. La contraseña de aplicación permanece únicamente en el servidor.</w:t>
+      </w:r>
+    </w:p>
+    <w:p>
+      <w:pPr>
+        <w:pStyle w:val="Heading2"/>
+      </w:pPr>
+      <w:r>
+        <w:t>Cómo obtener e instalar el certificado TLS</w:t>
+      </w:r>
+    </w:p>
+    <w:p>
+      <w:pPr>
+        <w:pStyle w:val="ListNumber"/>
+      </w:pPr>
+      <w:r>
+        <w:t>Opción recomendada si la organización controla un dominio: crear un nombre como pricebot.dominio-de-la-organizacion.com y hacer que el DNS interno lo resuelva a 192.168.190.146. Solicitar un certificado público para ese nombre mediante ACME/Let's Encrypt y validación DNS-01. Este método permite mantener la aplicación solo en la LAN, sin abrir puertos entrantes en el router; se necesita acceso autorizado al DNS del dominio y renovación automática.</w:t>
+      </w:r>
+    </w:p>
+    <w:p>
+      <w:pPr>
+        <w:pStyle w:val="ListNumber"/>
+      </w:pPr>
+      <w:r>
+        <w:t>Let's Encrypt no emite certificados para la IP privada 192.168.190.146 ni para nombres internos no públicos. Si no hay un dominio controlado, TI debe usar una autoridad certificadora interna (por ejemplo, Caddy con CA interna o la PKI corporativa), emitir un certificado para un nombre DNS interno con SAN correcto e instalar de forma segura el certificado raíz de esa autoridad en cada PC autorizada. Sin esa instalación, los navegadores mostrarán una advertencia y no debe continuarse.</w:t>
+      </w:r>
+    </w:p>
+    <w:p>
+      <w:pPr>
+        <w:pStyle w:val="ListNumber"/>
+      </w:pPr>
+      <w:r>
+        <w:t>Instalación en PriceBot: guardar el certificado público y su clave privada fuera de Git, por ejemplo en C:\ProgramData\PriceBot\tls\. Restringir la ACL de la clave privada a la cuenta de servicio y administradores. Antes de iniciar, definir PRICEBOT_TLS_CERTFILE y PRICEBOT_TLS_KEYFILE con las rutas PEM, PRICEBOT_BIND_HOST=0.0.0.0, PRICEBOT_PUBLIC_URL=https://nombre-del-servidor:3000 y PRICEBOT_ALLOWED_ORIGINS con esa misma URL. La configuración también debe permitir https://nombre-del-servidor:8000 en PRICEBOT_CSP_CONNECT_SRC. Mantener PRICEBOT_REQUIRE_HTTPS=1 y PRICEBOT_COOKIE_SECURE=1.</w:t>
+      </w:r>
+    </w:p>
+    <w:p>
+      <w:pPr>
+        <w:pStyle w:val="ListNumber"/>
+      </w:pPr>
+      <w:r>
+        <w:t>Para que el doble clic en iniciar-servidor.bat use el certificado, TI debe guardar PRICEBOT_TLS_CERTFILE y PRICEBOT_TLS_KEYFILE en las variables de entorno de Windows (ámbito Equipo) con las rutas PEM. Si se usa un nombre DNS en vez de la IP, definir también PRICEBOT_PUBLIC_URL, PRICEBOT_ALLOWED_ORIGINS y PRICEBOT_CSP_CONNECT_SRC para ese nombre; el lanzador conserva esos valores. Abrir una consola nueva después del cambio. No guardar la clave privada dentro del repositorio.</w:t>
+      </w:r>
+    </w:p>
+    <w:p>
+      <w:pPr>
+        <w:pStyle w:val="ListNumber"/>
+      </w:pPr>
+      <w:r>
+        <w:t>Probar primero la URL HTTPS en el servidor y en cada PC autorizada: el nombre debe coincidir, la cadena debe ser confiable, no debe haber alertas y /health debe responder. Comprobar renovación antes del vencimiento. No compartir la clave privada por correo, chat ni repositorio.</w:t>
+      </w:r>
+    </w:p>
     <w:p/>
     <w:p>
       <w:pPr>
@@ -2029,7 +2074,7 @@
         <w:ind w:left="403" w:hanging="403"/>
       </w:pPr>
       <w:r>
-        <w:t>4. Comprobar http://127.0.0.1:3000 y luego http://192.168.190.146:3000 desde una PC autorizada.</w:t>
+        <w:t>4. Abrir http://127.0.0.1:3000 en el servidor y la URL HTTPS configurada para el certificado desde una PC autorizada.</w:t>
       </w:r>
     </w:p>
     <w:p>
@@ -2558,7 +2603,7 @@
     </w:p>
     <w:p>
       <w:r>
-        <w:t>Abrir http://127.0.0.1:3000 en la PC servidor y entrar en la pestaña Usuarios. Esta pestaña y sus endpoints solo aceptan solicitudes cuyo origen real y encabezado Host sean de loopback.</w:t>
+        <w:t>En la PC servidor, abrir http://127.0.0.1:3000 y entrar en Usuarios. La pestaña y sus endpoints solo aceptan solicitudes cuyo origen real y encabezado Host sean de loopback.</w:t>
       </w:r>
     </w:p>
     <w:p>
@@ -4189,7 +4234,7 @@
         <w:pStyle w:val="ListBullet"/>
       </w:pPr>
       <w:r>
-        <w:t>Prioridad alta: reemplazar HTTP por HTTPS confiable o una VPN antes de procesar documentación confidencial de forma habitual.</w:t>
+        <w:t>No usar HTTP remoto: transmite credenciales, sesiones y documentos sin cifrado. Mantener PRICEBOT_REQUIRE_HTTPS=1 y PRICEBOT_COOKIE_SECURE=1; no ignorar alertas de certificados.</w:t>
       </w:r>
     </w:p>
     <w:p>
@@ -4289,6 +4334,7 @@
     <w:p>
       <w:pPr>
         <w:pStyle w:val="Heading1"/>
+        <w:pageBreakBefore/>
       </w:pPr>
       <w:r>
         <w:t>Lista de verificación posterior a una actualización</w:t>
@@ -4297,6 +4343,7 @@
     <w:p>
       <w:pPr>
         <w:pStyle w:val="ListBullet"/>
+        <w:spacing w:after="0" w:line="240" w:lineRule="auto"/>
       </w:pPr>
       <w:r>
         <w:t>☐ El lanzador inicia backend y frontend sin errores.</w:t>
@@ -4305,6 +4352,7 @@
     <w:p>
       <w:pPr>
         <w:pStyle w:val="ListBullet"/>
+        <w:spacing w:after="0" w:line="240" w:lineRule="auto"/>
       </w:pPr>
       <w:r>
         <w:t>☐ La URL local entra como Administrador local sin solicitar contraseña.</w:t>
@@ -4313,14 +4361,16 @@
     <w:p>
       <w:pPr>
         <w:pStyle w:val="ListBullet"/>
+        <w:spacing w:after="0" w:line="240" w:lineRule="auto"/>
       </w:pPr>
       <w:r>
-        <w:t>☐ La URL LAN solicita correo y contraseña.</w:t>
+        <w:t>☐ La URL HTTPS abre sin alertas en cada PC y el correo de confirmación usa ese mismo nombre.</w:t>
       </w:r>
     </w:p>
     <w:p>
       <w:pPr>
         <w:pStyle w:val="ListBullet"/>
+        <w:spacing w:after="0" w:line="240" w:lineRule="auto"/>
       </w:pPr>
       <w:r>
         <w:t>☐ Crear, modificar, deshabilitar, habilitar y eliminar usuarios funciona.</w:t>
@@ -4329,14 +4379,7 @@
     <w:p>
       <w:pPr>
         <w:pStyle w:val="ListBullet"/>
-      </w:pPr>
-      <w:r>
-        <w:t>☐ El correo de confirmación llega y el enlace usa 192.168.190.146, no 127.0.0.1.</w:t>
-      </w:r>
-    </w:p>
-    <w:p>
-      <w:pPr>
-        <w:pStyle w:val="ListBullet"/>
+        <w:spacing w:after="0" w:line="240" w:lineRule="auto"/>
       </w:pPr>
       <w:r>
         <w:t>☐ Un archivo pequeño válido se procesa y descarga correctamente.</w:t>
@@ -4345,6 +4388,7 @@
     <w:p>
       <w:pPr>
         <w:pStyle w:val="ListBullet"/>
+        <w:spacing w:after="0" w:line="240" w:lineRule="auto"/>
       </w:pPr>
       <w:r>
         <w:t>☐ Un archivo con extensión falsa o tamaño excesivo es rechazado.</w:t>
@@ -4353,6 +4397,7 @@
     <w:p>
       <w:pPr>
         <w:pStyle w:val="ListBullet"/>
+        <w:spacing w:after="0" w:line="240" w:lineRule="auto"/>
       </w:pPr>
       <w:r>
         <w:t>☐ La salida coincide con una muestra del documento original.</w:t>
@@ -4361,9 +4406,26 @@
     <w:p>
       <w:pPr>
         <w:pStyle w:val="ListBullet"/>
+        <w:spacing w:after="0" w:line="240" w:lineRule="auto"/>
       </w:pPr>
       <w:r>
         <w:t>☐ IA externa solo con saldo aprobado; Git sin documentos ni secretos.</w:t>
+      </w:r>
+    </w:p>
+    <w:p>
+      <w:pPr>
+        <w:pStyle w:val="ListBullet"/>
+      </w:pPr>
+      <w:r>
+        <w:t>☐ Desde una PC autorizada, /health responde status ok por HTTPS sin advertencias.</w:t>
+      </w:r>
+    </w:p>
+    <w:p>
+      <w:pPr>
+        <w:pStyle w:val="ListBullet"/>
+      </w:pPr>
+      <w:r>
+        <w:t>☐ Una conexión HTTP remota se rechaza; no se aceptaron excepciones del navegador.</w:t>
       </w:r>
     </w:p>
     <w:sectPr>

</xml_diff>

<commit_message>
Simplifica acceso HTTPS LAN sin admin y actualiza manual operativo
</commit_message>
<xml_diff>
--- a/Documentacion/Manual_de_Administracion_y_Operacion_PriceBot.docx
+++ b/Documentacion/Manual_de_Administracion_y_Operacion_PriceBot.docx
@@ -8,6 +8,9 @@
         <w:jc w:val="left"/>
       </w:pPr>
       <w:r>
+        <w:rPr>
+          <w:color w:val="000000"/>
+        </w:rPr>
         <w:t>Manual de administración y operación de PriceBot</w:t>
       </w:r>
     </w:p>
@@ -296,7 +299,7 @@
           </w:tcPr>
           <w:p>
             <w:r>
-              <w:t>13 de octubre de 2026</w:t>
+              <w:t>13 de octubre de 2026 · Acceso HTTPS automático</w:t>
             </w:r>
           </w:p>
         </w:tc>
@@ -363,6 +366,9 @@
         <w:pStyle w:val="Heading1"/>
       </w:pPr>
       <w:r>
+        <w:rPr>
+          <w:color w:val="000000"/>
+        </w:rPr>
         <w:t>Objetivo y alcance</w:t>
       </w:r>
     </w:p>
@@ -381,12 +387,15 @@
         <w:pStyle w:val="Heading1"/>
       </w:pPr>
       <w:r>
+        <w:rPr>
+          <w:color w:val="000000"/>
+        </w:rPr>
         <w:t>Estado operativo y decisión de seguridad</w:t>
       </w:r>
     </w:p>
     <w:p>
       <w:r>
-        <w:t>El administrador opera desde la PC servidor mediante localhost. Para las demás computadoras, PriceBot exige HTTPS y un certificado TLS confiable. Sin certificado y clave configurados, el lanzador limita frontend y API a localhost; al instalarlos, habilita HTTPS en la LAN. No usar documentos ni credenciales remotas por HTTP.</w:t>
+        <w:t>El administrador opera en el servidor desde https://127.0.0.1:3000. Los usuarios acceden por https://192.168.190.146:3000 dentro de la LAN, con confianza en la CA interna y correo confirmado. El lanzador mantiene HTTPS obligatorio en la red y cookies seguras. Sin certificado y clave configurados, solo permite uso local.</w:t>
       </w:r>
     </w:p>
     <w:p>
@@ -427,6 +436,9 @@
         <w:pageBreakBefore/>
       </w:pPr>
       <w:r>
+        <w:rPr>
+          <w:color w:val="000000"/>
+        </w:rPr>
         <w:t>Enlaces y puntos de acceso</w:t>
       </w:r>
     </w:p>
@@ -570,9 +582,15 @@
             <w:vAlign w:val="center"/>
           </w:tcPr>
           <w:p>
-            <w:r>
-              <w:t>http://127.0.0.1:3000</w:t>
-            </w:r>
+            <w:hyperlink r:id="rId21">
+              <w:r>
+                <w:rPr>
+                  <w:color w:val="0563C1"/>
+                  <w:u w:val="single"/>
+                </w:rPr>
+                <w:t>https://127.0.0.1:3000</w:t>
+              </w:r>
+            </w:hyperlink>
           </w:p>
         </w:tc>
         <w:tc>
@@ -653,7 +671,7 @@
           </w:tcPr>
           <w:p>
             <w:r>
-              <w:t>HTTPS; requiere certificado confiable cuyo SAN incluya el nombre o IP</w:t>
+              <w:t>HTTPS en la LAN; cada usuario instala confianza con el archivo automático</w:t>
             </w:r>
           </w:p>
         </w:tc>
@@ -1191,12 +1209,53 @@
           </w:p>
         </w:tc>
       </w:tr>
+      <w:tr>
+        <w:tc>
+          <w:tcPr>
+            <w:tcW w:type="dxa" w:w="3312"/>
+          </w:tcPr>
+          <w:p>
+            <w:r>
+              <w:t>Acceso automático de usuarios</w:t>
+            </w:r>
+          </w:p>
+        </w:tc>
+        <w:tc>
+          <w:tcPr>
+            <w:tcW w:type="dxa" w:w="3312"/>
+          </w:tcPr>
+          <w:p>
+            <w:hyperlink r:id="rId22">
+              <w:r>
+                <w:rPr>
+                  <w:color w:val="0563C1"/>
+                  <w:u w:val="single"/>
+                </w:rPr>
+                <w:t>Descargar el archivo de acceso</w:t>
+              </w:r>
+            </w:hyperlink>
+          </w:p>
+        </w:tc>
+        <w:tc>
+          <w:tcPr>
+            <w:tcW w:type="dxa" w:w="3312"/>
+          </w:tcPr>
+          <w:p>
+            <w:r>
+              <w:t>Descargar el archivo original .bat desde GitHub o recibirlo de TI; ejecutar normalmente</w:t>
+            </w:r>
+          </w:p>
+        </w:tc>
+      </w:tr>
     </w:tbl>
     <w:p>
       <w:pPr>
         <w:pStyle w:val="Heading2"/>
       </w:pPr>
       <w:r>
+        <w:rPr>
+          <w:color w:val="000000"/>
+        </w:rPr>
         <w:t>Acceso según el perfil</w:t>
       </w:r>
     </w:p>
@@ -1205,7 +1264,7 @@
         <w:spacing w:after="100"/>
       </w:pPr>
       <w:r>
-        <w:t>Administración: en la PC servidor, abrir http://127.0.0.1:3000 y entrar en Usuarios. El acceso local funciona como administrador sin contraseña de PriceBot; proteger la PC con una cuenta Windows individual, bloqueo automático y disco cifrado. La administración de usuarios se rechaza desde otras computadoras.</w:t>
+        <w:t>Administración: en el servidor abrir https://127.0.0.1:3000. Debe aparecer Usuario: Administrador local y la pestaña Usuarios junto a Subir Archivos y Resultados. El acceso local depende de la cuenta y sesión de Windows; la URL de la IP LAN no muestra administración aunque se abra en el servidor.</w:t>
       </w:r>
     </w:p>
     <w:p>
@@ -1221,7 +1280,7 @@
         <w:spacing w:after="100"/>
       </w:pPr>
       <w:r>
-        <w:t>Antes del primer acceso remoto, TI debe obtener e instalar un certificado TLS confiable que incluya en SAN el nombre DNS usado por las PCs (o la IP privada exacta si la CA interna emite para IP). El lanzador exige HTTPS y cookies seguras; sin certificado válido, los clientes deben rechazar la conexión.</w:t>
+        <w:t>Antes del acceso remoto, TI instala el certificado interno para la IP del servidor y los accesos locales. Cada usuario ejecuta CONFIGURAR-PRICEBOT-LAN.bat para verificar e instalar la confianza pública en su propia cuenta Windows. Instalar la CA no concede permisos dentro de PriceBot.</w:t>
       </w:r>
     </w:p>
     <w:p>
@@ -1234,10 +1293,425 @@
     </w:p>
     <w:p>
       <w:pPr>
-        <w:spacing w:after="100"/>
+        <w:pStyle w:val="Heading1"/>
+        <w:pageBreakBefore w:val="0"/>
       </w:pPr>
       <w:r>
-        <w:t>Para que lleguen las confirmaciones, el servidor debe tener SMTP de Gmail configurado en pricebot/.env y PRICEBOT_PUBLIC_URL debe coincidir con la URL HTTPS usada por las PCs. La contraseña de aplicación permanece únicamente en el servidor.</w:t>
+        <w:rPr>
+          <w:color w:val="000000"/>
+        </w:rPr>
+        <w:t>Certificados y acceso en la red privada</w:t>
+      </w:r>
+    </w:p>
+    <w:p>
+      <w:pPr/>
+      <w:r>
+        <w:t>PriceBot se utiliza en la LAN privada 192.168.190.0/24 sin dominio. Una autoridad certificadora interna, o CA, emite el certificado para 192.168.190.146 y los accesos locales 127.0.0.1, localhost y ::1. Cada usuario Windows debe confiar en su raíz pública antes de ingresar. Esa confianza permite verificar HTTPS; los permisos de PriceBot dependen del correo y contraseña confirmados.</w:t>
+      </w:r>
+    </w:p>
+    <w:tbl>
+      <w:tblPr>
+        <w:tblW w:type="auto" w:w="0"/>
+        <w:tblLayout w:type="fixed"/>
+        <w:tblLook w:firstColumn="1" w:firstRow="1" w:lastColumn="0" w:lastRow="0" w:noHBand="0" w:noVBand="1" w:val="04A0"/>
+        <w:tblBorders>
+          <w:top w:val="single" w:sz="4" w:color="D9D9D9"/>
+          <w:left w:val="single" w:sz="4" w:color="D9D9D9"/>
+          <w:bottom w:val="single" w:sz="4" w:color="D9D9D9"/>
+          <w:right w:val="single" w:sz="4" w:color="D9D9D9"/>
+          <w:insideH w:val="single" w:sz="4" w:color="D9D9D9"/>
+          <w:insideV w:val="single" w:sz="4" w:color="D9D9D9"/>
+        </w:tblBorders>
+      </w:tblPr>
+      <w:tblGrid>
+        <w:gridCol w:w="1800"/>
+        <w:gridCol w:w="5040"/>
+        <w:gridCol w:w="3168"/>
+      </w:tblGrid>
+      <w:tr>
+        <w:trPr>
+          <w:cantSplit/>
+          <w:tblHeader/>
+        </w:trPr>
+        <w:tc>
+          <w:tcPr>
+            <w:tcW w:type="dxa" w:w="2160"/>
+            <w:vAlign w:val="center"/>
+            <w:shd w:fill="193B51"/>
+            <w:tcMar>
+              <w:top w:w="90" w:type="dxa"/>
+              <w:bottom w:w="90" w:type="dxa"/>
+              <w:left w:w="110" w:type="dxa"/>
+              <w:right w:w="110" w:type="dxa"/>
+            </w:tcMar>
+          </w:tcPr>
+          <w:p>
+            <w:pPr>
+              <w:spacing w:after="0"/>
+            </w:pPr>
+            <w:r>
+              <w:rPr>
+                <w:b/>
+                <w:color w:val="FFFFFF"/>
+                <w:sz w:val="20"/>
+              </w:rPr>
+              <w:t>Rol</w:t>
+            </w:r>
+          </w:p>
+        </w:tc>
+        <w:tc>
+          <w:tcPr>
+            <w:tcW w:type="dxa" w:w="4032"/>
+            <w:vAlign w:val="center"/>
+            <w:shd w:fill="193B51"/>
+            <w:tcMar>
+              <w:top w:w="90" w:type="dxa"/>
+              <w:bottom w:w="90" w:type="dxa"/>
+              <w:left w:w="110" w:type="dxa"/>
+              <w:right w:w="110" w:type="dxa"/>
+            </w:tcMar>
+          </w:tcPr>
+          <w:p>
+            <w:pPr>
+              <w:spacing w:after="0"/>
+            </w:pPr>
+            <w:r>
+              <w:rPr>
+                <w:b/>
+                <w:color w:val="FFFFFF"/>
+                <w:sz w:val="20"/>
+              </w:rPr>
+              <w:t>Responsabilidad</w:t>
+            </w:r>
+          </w:p>
+        </w:tc>
+        <w:tc>
+          <w:tcPr>
+            <w:tcW w:type="dxa" w:w="3168"/>
+            <w:vAlign w:val="center"/>
+            <w:shd w:fill="193B51"/>
+            <w:tcMar>
+              <w:top w:w="90" w:type="dxa"/>
+              <w:bottom w:w="90" w:type="dxa"/>
+              <w:left w:w="110" w:type="dxa"/>
+              <w:right w:w="110" w:type="dxa"/>
+            </w:tcMar>
+          </w:tcPr>
+          <w:p>
+            <w:pPr>
+              <w:spacing w:after="0"/>
+            </w:pPr>
+            <w:r>
+              <w:rPr>
+                <w:b/>
+                <w:color w:val="FFFFFF"/>
+                <w:sz w:val="20"/>
+              </w:rPr>
+              <w:t>Permisos de Windows</w:t>
+            </w:r>
+          </w:p>
+        </w:tc>
+      </w:tr>
+      <w:tr>
+        <w:trPr>
+          <w:cantSplit/>
+        </w:trPr>
+        <w:tc>
+          <w:tcPr>
+            <w:tcW w:type="dxa" w:w="2160"/>
+            <w:vAlign w:val="center"/>
+            <w:shd w:fill="FFFFFF"/>
+            <w:tcMar>
+              <w:top w:w="90" w:type="dxa"/>
+              <w:bottom w:w="90" w:type="dxa"/>
+              <w:left w:w="110" w:type="dxa"/>
+              <w:right w:w="110" w:type="dxa"/>
+            </w:tcMar>
+          </w:tcPr>
+          <w:p>
+            <w:pPr>
+              <w:spacing w:after="0"/>
+            </w:pPr>
+            <w:r>
+              <w:rPr>
+                <w:b w:val="0"/>
+                <w:color w:val="000000"/>
+                <w:sz w:val="20"/>
+              </w:rPr>
+              <w:t>TI del servidor</w:t>
+            </w:r>
+          </w:p>
+        </w:tc>
+        <w:tc>
+          <w:tcPr>
+            <w:tcW w:type="dxa" w:w="4032"/>
+            <w:vAlign w:val="center"/>
+            <w:shd w:fill="FFFFFF"/>
+            <w:tcMar>
+              <w:top w:w="90" w:type="dxa"/>
+              <w:bottom w:w="90" w:type="dxa"/>
+              <w:left w:w="110" w:type="dxa"/>
+              <w:right w:w="110" w:type="dxa"/>
+            </w:tcMar>
+          </w:tcPr>
+          <w:p>
+            <w:pPr>
+              <w:spacing w:after="0"/>
+            </w:pPr>
+            <w:r>
+              <w:rPr>
+                <w:b w:val="0"/>
+                <w:color w:val="000000"/>
+                <w:sz w:val="20"/>
+              </w:rPr>
+              <w:t>Instalar y renovar certificados; custodiar claves y frase de la CA; mantener IP y firewall.</w:t>
+            </w:r>
+          </w:p>
+        </w:tc>
+        <w:tc>
+          <w:tcPr>
+            <w:tcW w:type="dxa" w:w="3168"/>
+            <w:vAlign w:val="center"/>
+            <w:shd w:fill="FFFFFF"/>
+            <w:tcMar>
+              <w:top w:w="90" w:type="dxa"/>
+              <w:bottom w:w="90" w:type="dxa"/>
+              <w:left w:w="110" w:type="dxa"/>
+              <w:right w:w="110" w:type="dxa"/>
+            </w:tcMar>
+          </w:tcPr>
+          <w:p>
+            <w:pPr>
+              <w:spacing w:after="0"/>
+            </w:pPr>
+            <w:r>
+              <w:rPr>
+                <w:b w:val="0"/>
+                <w:color w:val="000000"/>
+                <w:sz w:val="20"/>
+              </w:rPr>
+              <w:t>Administrador para instalar o renovar el servidor.</w:t>
+            </w:r>
+          </w:p>
+        </w:tc>
+      </w:tr>
+      <w:tr>
+        <w:trPr>
+          <w:cantSplit/>
+        </w:trPr>
+        <w:tc>
+          <w:tcPr>
+            <w:tcW w:type="dxa" w:w="2160"/>
+            <w:vAlign w:val="center"/>
+            <w:shd w:fill="EAF2F7"/>
+            <w:tcMar>
+              <w:top w:w="90" w:type="dxa"/>
+              <w:bottom w:w="90" w:type="dxa"/>
+              <w:left w:w="110" w:type="dxa"/>
+              <w:right w:w="110" w:type="dxa"/>
+            </w:tcMar>
+          </w:tcPr>
+          <w:p>
+            <w:pPr>
+              <w:spacing w:after="0"/>
+            </w:pPr>
+            <w:r>
+              <w:rPr>
+                <w:b w:val="0"/>
+                <w:color w:val="000000"/>
+                <w:sz w:val="20"/>
+              </w:rPr>
+              <w:t>Administración de PriceBot</w:t>
+            </w:r>
+          </w:p>
+        </w:tc>
+        <w:tc>
+          <w:tcPr>
+            <w:tcW w:type="dxa" w:w="4032"/>
+            <w:vAlign w:val="center"/>
+            <w:shd w:fill="EAF2F7"/>
+            <w:tcMar>
+              <w:top w:w="90" w:type="dxa"/>
+              <w:bottom w:w="90" w:type="dxa"/>
+              <w:left w:w="110" w:type="dxa"/>
+              <w:right w:w="110" w:type="dxa"/>
+            </w:tcMar>
+          </w:tcPr>
+          <w:p>
+            <w:pPr>
+              <w:spacing w:after="0"/>
+            </w:pPr>
+            <w:r>
+              <w:rPr>
+                <w:b w:val="0"/>
+                <w:color w:val="000000"/>
+                <w:sz w:val="20"/>
+              </w:rPr>
+              <w:t>Crear, modificar, deshabilitar y eliminar usuarios desde el servidor; entregar el acceso preparado por TI.</w:t>
+            </w:r>
+          </w:p>
+        </w:tc>
+        <w:tc>
+          <w:tcPr>
+            <w:tcW w:type="dxa" w:w="3168"/>
+            <w:vAlign w:val="center"/>
+            <w:shd w:fill="EAF2F7"/>
+            <w:tcMar>
+              <w:top w:w="90" w:type="dxa"/>
+              <w:bottom w:w="90" w:type="dxa"/>
+              <w:left w:w="110" w:type="dxa"/>
+              <w:right w:w="110" w:type="dxa"/>
+            </w:tcMar>
+          </w:tcPr>
+          <w:p>
+            <w:pPr>
+              <w:spacing w:after="0"/>
+            </w:pPr>
+            <w:r>
+              <w:rPr>
+                <w:b w:val="0"/>
+                <w:color w:val="000000"/>
+                <w:sz w:val="20"/>
+              </w:rPr>
+              <w:t>Sesión Windows autorizada en el servidor para el uso diario.</w:t>
+            </w:r>
+          </w:p>
+        </w:tc>
+      </w:tr>
+      <w:tr>
+        <w:trPr>
+          <w:cantSplit/>
+        </w:trPr>
+        <w:tc>
+          <w:tcPr>
+            <w:tcW w:type="dxa" w:w="2160"/>
+            <w:vAlign w:val="center"/>
+            <w:shd w:fill="FFFFFF"/>
+            <w:tcMar>
+              <w:top w:w="90" w:type="dxa"/>
+              <w:bottom w:w="90" w:type="dxa"/>
+              <w:left w:w="110" w:type="dxa"/>
+              <w:right w:w="110" w:type="dxa"/>
+            </w:tcMar>
+          </w:tcPr>
+          <w:p>
+            <w:pPr>
+              <w:spacing w:after="0"/>
+            </w:pPr>
+            <w:r>
+              <w:rPr>
+                <w:b w:val="0"/>
+                <w:color w:val="000000"/>
+                <w:sz w:val="20"/>
+              </w:rPr>
+              <w:t>Usuario final</w:t>
+            </w:r>
+          </w:p>
+        </w:tc>
+        <w:tc>
+          <w:tcPr>
+            <w:tcW w:type="dxa" w:w="4032"/>
+            <w:vAlign w:val="center"/>
+            <w:shd w:fill="FFFFFF"/>
+            <w:tcMar>
+              <w:top w:w="90" w:type="dxa"/>
+              <w:bottom w:w="90" w:type="dxa"/>
+              <w:left w:w="110" w:type="dxa"/>
+              <w:right w:w="110" w:type="dxa"/>
+            </w:tcMar>
+          </w:tcPr>
+          <w:p>
+            <w:pPr>
+              <w:spacing w:after="0"/>
+            </w:pPr>
+            <w:r>
+              <w:rPr>
+                <w:b w:val="0"/>
+                <w:color w:val="000000"/>
+                <w:sz w:val="20"/>
+              </w:rPr>
+              <w:t>Ejecutar el acceso automático con su cuenta Windows e ingresar con correo y contraseña confirmados.</w:t>
+            </w:r>
+          </w:p>
+        </w:tc>
+        <w:tc>
+          <w:tcPr>
+            <w:tcW w:type="dxa" w:w="3168"/>
+            <w:vAlign w:val="center"/>
+            <w:shd w:fill="FFFFFF"/>
+            <w:tcMar>
+              <w:top w:w="90" w:type="dxa"/>
+              <w:bottom w:w="90" w:type="dxa"/>
+              <w:left w:w="110" w:type="dxa"/>
+              <w:right w:w="110" w:type="dxa"/>
+            </w:tcMar>
+          </w:tcPr>
+          <w:p>
+            <w:pPr>
+              <w:spacing w:after="0"/>
+            </w:pPr>
+            <w:r>
+              <w:rPr>
+                <w:b w:val="0"/>
+                <w:color w:val="000000"/>
+                <w:sz w:val="20"/>
+              </w:rPr>
+              <w:t>No necesita administrador para instalar en su propio usuario.</w:t>
+            </w:r>
+          </w:p>
+        </w:tc>
+      </w:tr>
+    </w:tbl>
+    <w:p>
+      <w:pPr>
+        <w:spacing w:after="0"/>
+      </w:pPr>
+    </w:p>
+    <w:p>
+      <w:pPr>
+        <w:pStyle w:val="Heading2"/>
+      </w:pPr>
+      <w:r>
+        <w:rPr>
+          <w:color w:val="000000"/>
+        </w:rPr>
+        <w:t>Instalación del servidor a cargo de TI</w:t>
+      </w:r>
+    </w:p>
+    <w:p>
+      <w:pPr/>
+      <w:r>
+        <w:t>1. En el servidor, actualizar con git pull en C:\Users\Soporte\Documents\AnalizadorPlanillas. Instalar las dependencias con instalar.bat si faltan. Cerrar las ventanas de PriceBot antes de instalar o renovar certificados.</w:t>
+      </w:r>
+    </w:p>
+    <w:p>
+      <w:pPr/>
+      <w:r>
+        <w:t>2. Confirmar la IP 192.168.190.146, reservarla en DHCP o con TI y mantener la interfaz de red en perfil Privado. Ejecutar TLS_LAN\INSTALAR-SERVIDOR.bat con clic derecho y Ejecutar como administrador.</w:t>
+      </w:r>
+    </w:p>
+    <w:p>
+      <w:pPr/>
+      <w:r>
+        <w:t>3. Ingresar la ruta del repo y la cuenta Windows que inicia PriceBot, por ejemplo SERVERA\Soporte. Elegir una frase de al menos 16 caracteres para cifrar la clave de la CA y guardarla en el gestor de secretos corporativo. No documentar su valor ni distribuirla a usuarios.</w:t>
+      </w:r>
+    </w:p>
+    <w:p>
+      <w:pPr/>
+      <w:r>
+        <w:t>4. Esperar INSTALACION TERMINADA. El instalador genera certificados, instala la confianza del servidor, guarda launch-config.json y restringe las reglas de firewall de PriceBot a la subred privada. Confianza instalada es un mensaje intermedio y no sustituye al de instalación terminada.</w:t>
+      </w:r>
+    </w:p>
+    <w:p>
+      <w:pPr/>
+      <w:r>
+        <w:t>5. Iniciar normalmente con C:\ProgramData\PriceBotTLS\INICIAR-PRICEBOT-SEGURO.bat. Este lanzador carga la configuración guardada; no es necesario repetir la instalación en cada arranque. Mantener encendida la PC y abiertas las ventanas del backend y frontend.</w:t>
+      </w:r>
+    </w:p>
+    <w:p>
+      <w:pPr/>
+      <w:r>
+        <w:t>6. Verificar https://127.0.0.1:3000 para Administración y https://192.168.190.146:8000/health para diagnóstico de la API. Ambas conexiones deben ser confiables y la API debe responder status ok.</w:t>
       </w:r>
     </w:p>
     <w:p>
@@ -1245,55 +1719,136 @@
         <w:pStyle w:val="Heading2"/>
       </w:pPr>
       <w:r>
-        <w:t>Cómo obtener e instalar el certificado TLS</w:t>
+        <w:rPr>
+          <w:color w:val="000000"/>
+        </w:rPr>
+        <w:t>Preparar el acceso para los usuarios</w:t>
+      </w:r>
+    </w:p>
+    <w:p>
+      <w:pPr/>
+      <w:r>
+        <w:t>1. Si el servidor ya tiene certificados válidos, actualizar el repo y ejecutar TLS_LAN\PREPARAR-CLIENTES.bat desde la cuenta autorizada. Solo necesita leer la configuración pública instalada y escribir en el repo. No lee claves privadas, no renueva certificados y no requiere cerrar PriceBot.</w:t>
+      </w:r>
+    </w:p>
+    <w:p>
+      <w:pPr/>
+      <w:r>
+        <w:t>2. Entregar a cada persona el archivo del repo dist\CONFIGURAR-PRICEBOT-LAN.bat, o el ZIP dist\Clientes-PriceBot-SinAdmin.zip. Una instalación nueva también genera el archivo dentro de C:\ProgramData\PriceBotTLS\Clientes y lo incluye en Clientes-PriceBot.zip.</w:t>
+      </w:r>
+    </w:p>
+    <w:p>
+      <w:pPr/>
+      <w:r>
+        <w:t>3. Distribuirlo desde TI o por el repositorio corporativo verificado. El archivo independiente incorpora únicamente el certificado público y su huella SHA-256 verificada; no contiene claves privadas, contraseñas de usuarios ni la frase de la CA.</w:t>
+      </w:r>
+    </w:p>
+    <w:p>
+      <w:pPr/>
+      <w:r>
+        <w:t>4. Si cambia la CA o la IP del servidor, generar y distribuir un archivo nuevo. El script publicado en Documentacion\CONFIGURAR-PRICEBOT-LAN.bat corresponde a la CA y la IP de referencia de esta edición.</w:t>
       </w:r>
     </w:p>
     <w:p>
       <w:pPr>
-        <w:pStyle w:val="ListNumber"/>
+        <w:pStyle w:val="Heading2"/>
       </w:pPr>
       <w:r>
-        <w:t>Opción recomendada si la organización controla un dominio: crear un nombre como pricebot.dominio-de-la-organizacion.com y hacer que el DNS interno lo resuelva a 192.168.190.146. Solicitar un certificado público para ese nombre mediante ACME/Let's Encrypt y validación DNS-01. Este método permite mantener la aplicación solo en la LAN, sin abrir puertos entrantes en el router; se necesita acceso autorizado al DNS del dominio y renovación automática.</w:t>
+        <w:rPr>
+          <w:color w:val="000000"/>
+        </w:rPr>
+        <w:t>Pasos de cada usuario en su computadora</w:t>
+      </w:r>
+    </w:p>
+    <w:p>
+      <w:pPr/>
+      <w:r>
+        <w:t>1. Recibir CONFIGURAR-PRICEBOT-LAN.bat del responsable y guardarlo en su PC. También puede extraer el ZIP cliente completo. El archivo .bat independiente funciona sin copiar otros archivos.</w:t>
+      </w:r>
+    </w:p>
+    <w:p>
+      <w:pPr/>
+      <w:r>
+        <w:t>2. Hacer doble clic con el usuario Windows que utilizará el sistema. No elegir Ejecutar como otro usuario. El script verifica automáticamente la CA y su huella, instala confianza solo para esa sesión de usuario, comprueba sitio y API por HTTPS válido y abre PriceBot. No pide pegar la huella ni contraseña de administrador.</w:t>
+      </w:r>
+    </w:p>
+    <w:p>
+      <w:pPr/>
+      <w:r>
+        <w:t>3. Esperar ACCESO CONFIGURADO. Windows puede mostrar un aviso de ejecución o confianza según la política corporativa. Si la política bloquea instalar raíces, solicitar la distribución a TI; el script no cambia automáticamente al almacén de toda la PC.</w:t>
+      </w:r>
+    </w:p>
+    <w:p>
+      <w:pPr/>
+      <w:r>
+        <w:t>4. Abrir https://192.168.190.146:3000 e ingresar con el correo y contraseña asignados por Administración. Confirmar primero el correo mediante el enlace recibido desde una PC configurada y dentro de la LAN. La frase de la CA no se utiliza para iniciar sesión.</w:t>
+      </w:r>
+    </w:p>
+    <w:p>
+      <w:pPr/>
+      <w:r>
+        <w:t>5. Si el navegador conserva ERR_CERT_AUTHORITY_INVALID, cerrarlo completamente y abrirlo de nuevo. Si se usa el navegador integrado de Codex, reiniciar Codex cuando conserve la alerta. Cada usuario Windows de una misma PC debe instalar su propia confianza, salvo que TI instale para toda la PC.</w:t>
+      </w:r>
+    </w:p>
+    <w:p>
+      <w:pPr/>
+      <w:r>
+        <w:t>Alternativa manual: INSTALAR-SOLO-USUARIO.bat comprueba la huella pegada por el usuario y usa CurrentUser. INSTALAR-CLIENTE.bat requiere administrador Windows y usa LocalMachine para toda la PC. Ambas opciones mantienen la validación de certificados.</w:t>
       </w:r>
     </w:p>
     <w:p>
       <w:pPr>
-        <w:pStyle w:val="ListNumber"/>
+        <w:pStyle w:val="Heading2"/>
       </w:pPr>
       <w:r>
-        <w:t>Let's Encrypt no emite certificados para la IP privada 192.168.190.146 ni para nombres internos no públicos. Si no hay un dominio controlado, TI debe usar una autoridad certificadora interna (por ejemplo, Caddy con CA interna o la PKI corporativa), emitir un certificado para un nombre DNS interno con SAN correcto e instalar de forma segura el certificado raíz de esa autoridad en cada PC autorizada. Sin esa instalación, los navegadores mostrarán una advertencia y no debe continuarse.</w:t>
+        <w:rPr>
+          <w:color w:val="000000"/>
+        </w:rPr>
+        <w:t>Renovación y custodia de certificados</w:t>
       </w:r>
     </w:p>
     <w:p>
-      <w:pPr>
-        <w:pStyle w:val="ListNumber"/>
-      </w:pPr>
+      <w:pPr/>
       <w:r>
-        <w:t>Instalación en PriceBot: guardar el certificado público y su clave privada fuera de Git, por ejemplo en C:\ProgramData\PriceBot\tls\. Restringir la ACL de la clave privada a la cuenta de servicio y administradores. Antes de iniciar, definir PRICEBOT_TLS_CERTFILE y PRICEBOT_TLS_KEYFILE con las rutas PEM, PRICEBOT_BIND_HOST=0.0.0.0, PRICEBOT_PUBLIC_URL=https://nombre-del-servidor:3000 y PRICEBOT_ALLOWED_ORIGINS con esa misma URL. La configuración también debe permitir https://nombre-del-servidor:8000 en PRICEBOT_CSP_CONNECT_SRC. Mantener PRICEBOT_REQUIRE_HTTPS=1 y PRICEBOT_COOKIE_SECURE=1.</w:t>
+        <w:t>El certificado del servidor dura un año y la CA cinco años. TI debe revisar las fechas vigentes en C:\ProgramData\PriceBotTLS\certificates.json y renovar 30 días antes del vencimiento del servidor: cerrar PriceBot y ejecutar nuevamente el instalador con la misma frase de la CA. El kit no programa renovación automática ni un servicio de revocación CRL/OCSP.</w:t>
       </w:r>
     </w:p>
     <w:p>
-      <w:pPr>
-        <w:pStyle w:val="ListNumber"/>
-      </w:pPr>
+      <w:pPr/>
       <w:r>
-        <w:t>Para que el doble clic en iniciar-servidor.bat use el certificado, TI debe guardar PRICEBOT_TLS_CERTFILE y PRICEBOT_TLS_KEYFILE en las variables de entorno de Windows (ámbito Equipo) con las rutas PEM. Si se usa un nombre DNS en vez de la IP, definir también PRICEBOT_PUBLIC_URL, PRICEBOT_ALLOWED_ORIGINS y PRICEBOT_CSP_CONNECT_SRC para ese nombre; el lanzador conserva esos valores. Abrir una consola nueva después del cambio. No guardar la clave privada dentro del repositorio.</w:t>
+        <w:t>La renovación conserva la CA y reemplaza el certificado y clave del servidor. Si no cambia la CA, los usuarios no necesitan instalar de nuevo la raíz. Planificar con TI la sustitución de la CA antes de que su vigencia restante impida emitir un certificado anual.</w:t>
       </w:r>
     </w:p>
     <w:p>
-      <w:pPr>
-        <w:pStyle w:val="ListNumber"/>
-      </w:pPr>
+      <w:pPr/>
       <w:r>
-        <w:t>Probar primero la URL HTTPS en el servidor y en cada PC autorizada: el nombre debe coincidir, la cadena debe ser confiable, no debe haber alertas y /health debe responder. Comprobar renovación antes del vencimiento. No compartir la clave privada por correo, chat ni repositorio.</w:t>
+        <w:t>Custodiar ca\ca-key-encrypted.pem, server-key.pem, la frase de la CA y los respaldos cifrados en el servidor o gestor corporativo. Solo distribuir el archivo de acceso automático o el ZIP cliente público. HTTPS protege el tránsito; discos, descargas y respaldos necesitan cifrado y permisos propios.</w:t>
       </w:r>
     </w:p>
-    <w:p/>
+    <w:p>
+      <w:pPr/>
+      <w:r>
+        <w:t>Huella SHA-256 pública de referencia de esta edición:</w:t>
+      </w:r>
+    </w:p>
+    <w:p>
+      <w:pPr/>
+      <w:r>
+        <w:rPr>
+          <w:rFonts w:ascii="Consolas" w:hAnsi="Consolas"/>
+          <w:sz w:val="18"/>
+        </w:rPr>
+        <w:t>E9A752ABC8A20E7E347ADE114A5BFCB3BD585AAD5EED4D2ED984C3BF27997DF3</w:t>
+      </w:r>
+    </w:p>
     <w:p>
       <w:pPr>
         <w:pStyle w:val="Heading1"/>
       </w:pPr>
       <w:r>
+        <w:rPr>
+          <w:color w:val="000000"/>
+        </w:rPr>
         <w:t>Inventario de cuentas y responsables</w:t>
       </w:r>
     </w:p>
@@ -2038,6 +2593,9 @@
         <w:pStyle w:val="Heading1"/>
       </w:pPr>
       <w:r>
+        <w:rPr>
+          <w:color w:val="000000"/>
+        </w:rPr>
         <w:t>Inicio y detención del servidor</w:t>
       </w:r>
     </w:p>
@@ -2065,7 +2623,7 @@
         <w:ind w:left="403" w:hanging="403"/>
       </w:pPr>
       <w:r>
-        <w:t>3. Hacer doble clic en iniciar-servidor.bat y mantener abiertas las ventanas del backend y frontend.</w:t>
+        <w:t>3. Hacer doble clic en C:\ProgramData\PriceBotTLS\INICIAR-PRICEBOT-SEGURO.bat. Mantener abiertas las ventanas del backend y frontend.</w:t>
       </w:r>
     </w:p>
     <w:p>
@@ -2074,7 +2632,7 @@
         <w:ind w:left="403" w:hanging="403"/>
       </w:pPr>
       <w:r>
-        <w:t>4. Abrir http://127.0.0.1:3000 en el servidor y la URL HTTPS configurada para el certificado desde una PC autorizada.</w:t>
+        <w:t>4. Abrir https://127.0.0.1:3000 para Administración local y https://192.168.190.146:3000 desde una PC configurada y autorizada.</w:t>
       </w:r>
     </w:p>
     <w:p>
@@ -2096,6 +2654,9 @@
         <w:pStyle w:val="Heading1"/>
       </w:pPr>
       <w:r>
+        <w:rPr>
+          <w:color w:val="000000"/>
+        </w:rPr>
         <w:t>Uso diario</w:t>
       </w:r>
     </w:p>
@@ -2158,6 +2719,9 @@
         <w:pStyle w:val="Heading2"/>
       </w:pPr>
       <w:r>
+        <w:rPr>
+          <w:color w:val="000000"/>
+        </w:rPr>
         <w:t>Formatos y tratamiento de datos</w:t>
       </w:r>
     </w:p>
@@ -2167,6 +2731,14 @@
         <w:jc w:val="center"/>
         <w:tblLayout w:type="fixed"/>
         <w:tblLook w:firstColumn="1" w:firstRow="1" w:lastColumn="0" w:lastRow="0" w:noHBand="0" w:noVBand="1" w:val="04A0"/>
+        <w:tblBorders>
+          <w:top w:val="single" w:sz="4" w:color="D9D9D9"/>
+          <w:left w:val="single" w:sz="4" w:color="D9D9D9"/>
+          <w:bottom w:val="single" w:sz="4" w:color="D9D9D9"/>
+          <w:right w:val="single" w:sz="4" w:color="D9D9D9"/>
+          <w:insideH w:val="single" w:sz="4" w:color="D9D9D9"/>
+          <w:insideV w:val="single" w:sz="4" w:color="D9D9D9"/>
+        </w:tblBorders>
         <w:tblBorders>
           <w:top w:val="single" w:sz="4" w:color="D9D9D9"/>
           <w:left w:val="single" w:sz="4" w:color="D9D9D9"/>
@@ -2186,6 +2758,8 @@
         <w:trPr>
           <w:tblHeader w:val="true"/>
           <w:cantSplit/>
+          <w:cantSplit/>
+          <w:tblHeader/>
         </w:trPr>
         <w:tc>
           <w:tcPr>
@@ -2198,16 +2772,24 @@
               <w:end w:w="110" w:type="dxa"/>
             </w:tcMar>
             <w:vAlign w:val="center"/>
+            <w:shd w:fill="193B51"/>
+            <w:tcMar>
+              <w:top w:w="90" w:type="dxa"/>
+              <w:bottom w:w="90" w:type="dxa"/>
+              <w:left w:w="110" w:type="dxa"/>
+              <w:right w:w="110" w:type="dxa"/>
+            </w:tcMar>
           </w:tcPr>
           <w:p>
             <w:pPr>
+              <w:spacing w:after="0"/>
               <w:jc w:val="center"/>
             </w:pPr>
             <w:r>
               <w:rPr>
                 <w:b/>
                 <w:color w:val="FFFFFF"/>
-                <w:sz w:val="19"/>
+                <w:sz w:val="20"/>
               </w:rPr>
               <w:t>Formato</w:t>
             </w:r>
@@ -2224,16 +2806,24 @@
               <w:end w:w="110" w:type="dxa"/>
             </w:tcMar>
             <w:vAlign w:val="center"/>
+            <w:shd w:fill="193B51"/>
+            <w:tcMar>
+              <w:top w:w="90" w:type="dxa"/>
+              <w:bottom w:w="90" w:type="dxa"/>
+              <w:left w:w="110" w:type="dxa"/>
+              <w:right w:w="110" w:type="dxa"/>
+            </w:tcMar>
           </w:tcPr>
           <w:p>
             <w:pPr>
+              <w:spacing w:after="0"/>
               <w:jc w:val="center"/>
             </w:pPr>
             <w:r>
               <w:rPr>
                 <w:b/>
                 <w:color w:val="FFFFFF"/>
-                <w:sz w:val="19"/>
+                <w:sz w:val="20"/>
               </w:rPr>
               <w:t>Procesamiento</w:t>
             </w:r>
@@ -2250,16 +2840,24 @@
               <w:end w:w="110" w:type="dxa"/>
             </w:tcMar>
             <w:vAlign w:val="center"/>
+            <w:shd w:fill="193B51"/>
+            <w:tcMar>
+              <w:top w:w="90" w:type="dxa"/>
+              <w:bottom w:w="90" w:type="dxa"/>
+              <w:left w:w="110" w:type="dxa"/>
+              <w:right w:w="110" w:type="dxa"/>
+            </w:tcMar>
           </w:tcPr>
           <w:p>
             <w:pPr>
+              <w:spacing w:after="0"/>
               <w:jc w:val="center"/>
             </w:pPr>
             <w:r>
               <w:rPr>
                 <w:b/>
                 <w:color w:val="FFFFFF"/>
-                <w:sz w:val="19"/>
+                <w:sz w:val="20"/>
               </w:rPr>
               <w:t>IA externa</w:t>
             </w:r>
@@ -2276,16 +2874,24 @@
               <w:end w:w="110" w:type="dxa"/>
             </w:tcMar>
             <w:vAlign w:val="center"/>
+            <w:shd w:fill="193B51"/>
+            <w:tcMar>
+              <w:top w:w="90" w:type="dxa"/>
+              <w:bottom w:w="90" w:type="dxa"/>
+              <w:left w:w="110" w:type="dxa"/>
+              <w:right w:w="110" w:type="dxa"/>
+            </w:tcMar>
           </w:tcPr>
           <w:p>
             <w:pPr>
+              <w:spacing w:after="0"/>
               <w:jc w:val="center"/>
             </w:pPr>
             <w:r>
               <w:rPr>
                 <w:b/>
                 <w:color w:val="FFFFFF"/>
-                <w:sz w:val="19"/>
+                <w:sz w:val="20"/>
               </w:rPr>
               <w:t>Control principal</w:t>
             </w:r>
@@ -2294,6 +2900,7 @@
       </w:tr>
       <w:tr>
         <w:trPr>
+          <w:cantSplit/>
           <w:cantSplit/>
         </w:trPr>
         <w:tc>
@@ -2306,6 +2913,13 @@
               <w:end w:w="110" w:type="dxa"/>
             </w:tcMar>
             <w:vAlign w:val="center"/>
+            <w:shd w:fill="FFFFFF"/>
+            <w:tcMar>
+              <w:top w:w="90" w:type="dxa"/>
+              <w:bottom w:w="90" w:type="dxa"/>
+              <w:left w:w="110" w:type="dxa"/>
+              <w:right w:w="110" w:type="dxa"/>
+            </w:tcMar>
           </w:tcPr>
           <w:p>
             <w:pPr>
@@ -2313,7 +2927,9 @@
             </w:pPr>
             <w:r>
               <w:rPr>
-                <w:sz w:val="19"/>
+                <w:b w:val="0"/>
+                <w:color w:val="000000"/>
+                <w:sz w:val="20"/>
               </w:rPr>
               <w:t>XLS XLSX XLSM CSV</w:t>
             </w:r>
@@ -2329,6 +2945,13 @@
               <w:end w:w="110" w:type="dxa"/>
             </w:tcMar>
             <w:vAlign w:val="center"/>
+            <w:shd w:fill="FFFFFF"/>
+            <w:tcMar>
+              <w:top w:w="90" w:type="dxa"/>
+              <w:bottom w:w="90" w:type="dxa"/>
+              <w:left w:w="110" w:type="dxa"/>
+              <w:right w:w="110" w:type="dxa"/>
+            </w:tcMar>
           </w:tcPr>
           <w:p>
             <w:pPr>
@@ -2336,7 +2959,9 @@
             </w:pPr>
             <w:r>
               <w:rPr>
-                <w:sz w:val="19"/>
+                <w:b w:val="0"/>
+                <w:color w:val="000000"/>
+                <w:sz w:val="20"/>
               </w:rPr>
               <w:t>Local con pandas y librerías de Excel</w:t>
             </w:r>
@@ -2352,6 +2977,13 @@
               <w:end w:w="110" w:type="dxa"/>
             </w:tcMar>
             <w:vAlign w:val="center"/>
+            <w:shd w:fill="FFFFFF"/>
+            <w:tcMar>
+              <w:top w:w="90" w:type="dxa"/>
+              <w:bottom w:w="90" w:type="dxa"/>
+              <w:left w:w="110" w:type="dxa"/>
+              <w:right w:w="110" w:type="dxa"/>
+            </w:tcMar>
           </w:tcPr>
           <w:p>
             <w:pPr>
@@ -2359,7 +2991,9 @@
             </w:pPr>
             <w:r>
               <w:rPr>
-                <w:sz w:val="19"/>
+                <w:b w:val="0"/>
+                <w:color w:val="000000"/>
+                <w:sz w:val="20"/>
               </w:rPr>
               <w:t>No por defecto</w:t>
             </w:r>
@@ -2375,6 +3009,13 @@
               <w:end w:w="110" w:type="dxa"/>
             </w:tcMar>
             <w:vAlign w:val="center"/>
+            <w:shd w:fill="FFFFFF"/>
+            <w:tcMar>
+              <w:top w:w="90" w:type="dxa"/>
+              <w:bottom w:w="90" w:type="dxa"/>
+              <w:left w:w="110" w:type="dxa"/>
+              <w:right w:w="110" w:type="dxa"/>
+            </w:tcMar>
           </w:tcPr>
           <w:p>
             <w:pPr>
@@ -2382,7 +3023,9 @@
             </w:pPr>
             <w:r>
               <w:rPr>
-                <w:sz w:val="19"/>
+                <w:b w:val="0"/>
+                <w:color w:val="000000"/>
+                <w:sz w:val="20"/>
               </w:rPr>
               <w:t>Firma, estructura ZIP, tamaño y fórmulas de salida</w:t>
             </w:r>
@@ -2391,6 +3034,7 @@
       </w:tr>
       <w:tr>
         <w:trPr>
+          <w:cantSplit/>
           <w:cantSplit/>
         </w:trPr>
         <w:tc>
@@ -2404,6 +3048,13 @@
             </w:tcMar>
             <w:vAlign w:val="center"/>
             <w:shd w:fill="EAF3F8"/>
+            <w:shd w:fill="EAF2F7"/>
+            <w:tcMar>
+              <w:top w:w="90" w:type="dxa"/>
+              <w:bottom w:w="90" w:type="dxa"/>
+              <w:left w:w="110" w:type="dxa"/>
+              <w:right w:w="110" w:type="dxa"/>
+            </w:tcMar>
           </w:tcPr>
           <w:p>
             <w:pPr>
@@ -2411,7 +3062,9 @@
             </w:pPr>
             <w:r>
               <w:rPr>
-                <w:sz w:val="19"/>
+                <w:b w:val="0"/>
+                <w:color w:val="000000"/>
+                <w:sz w:val="20"/>
               </w:rPr>
               <w:t>PDF</w:t>
             </w:r>
@@ -2428,6 +3081,13 @@
             </w:tcMar>
             <w:vAlign w:val="center"/>
             <w:shd w:fill="EAF3F8"/>
+            <w:shd w:fill="EAF2F7"/>
+            <w:tcMar>
+              <w:top w:w="90" w:type="dxa"/>
+              <w:bottom w:w="90" w:type="dxa"/>
+              <w:left w:w="110" w:type="dxa"/>
+              <w:right w:w="110" w:type="dxa"/>
+            </w:tcMar>
           </w:tcPr>
           <w:p>
             <w:pPr>
@@ -2435,7 +3095,9 @@
             </w:pPr>
             <w:r>
               <w:rPr>
-                <w:sz w:val="19"/>
+                <w:b w:val="0"/>
+                <w:color w:val="000000"/>
+                <w:sz w:val="20"/>
               </w:rPr>
               <w:t>Texto tablas y reglas locales; complemento opcional</w:t>
             </w:r>
@@ -2452,6 +3114,13 @@
             </w:tcMar>
             <w:vAlign w:val="center"/>
             <w:shd w:fill="EAF3F8"/>
+            <w:shd w:fill="EAF2F7"/>
+            <w:tcMar>
+              <w:top w:w="90" w:type="dxa"/>
+              <w:bottom w:w="90" w:type="dxa"/>
+              <w:left w:w="110" w:type="dxa"/>
+              <w:right w:w="110" w:type="dxa"/>
+            </w:tcMar>
           </w:tcPr>
           <w:p>
             <w:pPr>
@@ -2459,7 +3128,9 @@
             </w:pPr>
             <w:r>
               <w:rPr>
-                <w:sz w:val="19"/>
+                <w:b w:val="0"/>
+                <w:color w:val="000000"/>
+                <w:sz w:val="20"/>
               </w:rPr>
               <w:t>Solo si está autorizada</w:t>
             </w:r>
@@ -2476,6 +3147,13 @@
             </w:tcMar>
             <w:vAlign w:val="center"/>
             <w:shd w:fill="EAF3F8"/>
+            <w:shd w:fill="EAF2F7"/>
+            <w:tcMar>
+              <w:top w:w="90" w:type="dxa"/>
+              <w:bottom w:w="90" w:type="dxa"/>
+              <w:left w:w="110" w:type="dxa"/>
+              <w:right w:w="110" w:type="dxa"/>
+            </w:tcMar>
           </w:tcPr>
           <w:p>
             <w:pPr>
@@ -2483,7 +3161,9 @@
             </w:pPr>
             <w:r>
               <w:rPr>
-                <w:sz w:val="19"/>
+                <w:b w:val="0"/>
+                <w:color w:val="000000"/>
+                <w:sz w:val="20"/>
               </w:rPr>
               <w:t>Firma, tamaño, páginas y tiempo máximo</w:t>
             </w:r>
@@ -2492,6 +3172,7 @@
       </w:tr>
       <w:tr>
         <w:trPr>
+          <w:cantSplit/>
           <w:cantSplit/>
         </w:trPr>
         <w:tc>
@@ -2504,6 +3185,13 @@
               <w:end w:w="110" w:type="dxa"/>
             </w:tcMar>
             <w:vAlign w:val="center"/>
+            <w:shd w:fill="FFFFFF"/>
+            <w:tcMar>
+              <w:top w:w="90" w:type="dxa"/>
+              <w:bottom w:w="90" w:type="dxa"/>
+              <w:left w:w="110" w:type="dxa"/>
+              <w:right w:w="110" w:type="dxa"/>
+            </w:tcMar>
           </w:tcPr>
           <w:p>
             <w:pPr>
@@ -2511,7 +3199,9 @@
             </w:pPr>
             <w:r>
               <w:rPr>
-                <w:sz w:val="19"/>
+                <w:b w:val="0"/>
+                <w:color w:val="000000"/>
+                <w:sz w:val="20"/>
               </w:rPr>
               <w:t>JPG JPEG PNG WEBP</w:t>
             </w:r>
@@ -2527,6 +3217,13 @@
               <w:end w:w="110" w:type="dxa"/>
             </w:tcMar>
             <w:vAlign w:val="center"/>
+            <w:shd w:fill="FFFFFF"/>
+            <w:tcMar>
+              <w:top w:w="90" w:type="dxa"/>
+              <w:bottom w:w="90" w:type="dxa"/>
+              <w:left w:w="110" w:type="dxa"/>
+              <w:right w:w="110" w:type="dxa"/>
+            </w:tcMar>
           </w:tcPr>
           <w:p>
             <w:pPr>
@@ -2534,7 +3231,9 @@
             </w:pPr>
             <w:r>
               <w:rPr>
-                <w:sz w:val="19"/>
+                <w:b w:val="0"/>
+                <w:color w:val="000000"/>
+                <w:sz w:val="20"/>
               </w:rPr>
               <w:t>Lectura de imagen y visión</w:t>
             </w:r>
@@ -2550,6 +3249,13 @@
               <w:end w:w="110" w:type="dxa"/>
             </w:tcMar>
             <w:vAlign w:val="center"/>
+            <w:shd w:fill="FFFFFF"/>
+            <w:tcMar>
+              <w:top w:w="90" w:type="dxa"/>
+              <w:bottom w:w="90" w:type="dxa"/>
+              <w:left w:w="110" w:type="dxa"/>
+              <w:right w:w="110" w:type="dxa"/>
+            </w:tcMar>
           </w:tcPr>
           <w:p>
             <w:pPr>
@@ -2557,7 +3263,9 @@
             </w:pPr>
             <w:r>
               <w:rPr>
-                <w:sz w:val="19"/>
+                <w:b w:val="0"/>
+                <w:color w:val="000000"/>
+                <w:sz w:val="20"/>
               </w:rPr>
               <w:t>Normalmente necesaria</w:t>
             </w:r>
@@ -2573,6 +3281,13 @@
               <w:end w:w="110" w:type="dxa"/>
             </w:tcMar>
             <w:vAlign w:val="center"/>
+            <w:shd w:fill="FFFFFF"/>
+            <w:tcMar>
+              <w:top w:w="90" w:type="dxa"/>
+              <w:bottom w:w="90" w:type="dxa"/>
+              <w:left w:w="110" w:type="dxa"/>
+              <w:right w:w="110" w:type="dxa"/>
+            </w:tcMar>
           </w:tcPr>
           <w:p>
             <w:pPr>
@@ -2580,9 +3295,120 @@
             </w:pPr>
             <w:r>
               <w:rPr>
-                <w:sz w:val="19"/>
+                <w:b w:val="0"/>
+                <w:color w:val="000000"/>
+                <w:sz w:val="20"/>
               </w:rPr>
               <w:t>Firma, integridad y límite de píxeles</w:t>
+            </w:r>
+          </w:p>
+        </w:tc>
+      </w:tr>
+      <w:tr>
+        <w:trPr>
+          <w:cantSplit/>
+        </w:trPr>
+        <w:tc>
+          <w:tcPr>
+            <w:tcW w:type="dxa" w:w="2484"/>
+            <w:vAlign w:val="center"/>
+            <w:shd w:fill="EAF2F7"/>
+            <w:tcMar>
+              <w:top w:w="90" w:type="dxa"/>
+              <w:bottom w:w="90" w:type="dxa"/>
+              <w:left w:w="110" w:type="dxa"/>
+              <w:right w:w="110" w:type="dxa"/>
+            </w:tcMar>
+          </w:tcPr>
+          <w:p>
+            <w:pPr>
+              <w:spacing w:after="0"/>
+            </w:pPr>
+            <w:r>
+              <w:rPr>
+                <w:b w:val="0"/>
+                <w:color w:val="000000"/>
+                <w:sz w:val="20"/>
+              </w:rPr>
+              <w:t>DOCX</w:t>
+            </w:r>
+          </w:p>
+        </w:tc>
+        <w:tc>
+          <w:tcPr>
+            <w:tcW w:type="dxa" w:w="2484"/>
+            <w:vAlign w:val="center"/>
+            <w:shd w:fill="EAF2F7"/>
+            <w:tcMar>
+              <w:top w:w="90" w:type="dxa"/>
+              <w:bottom w:w="90" w:type="dxa"/>
+              <w:left w:w="110" w:type="dxa"/>
+              <w:right w:w="110" w:type="dxa"/>
+            </w:tcMar>
+          </w:tcPr>
+          <w:p>
+            <w:pPr>
+              <w:spacing w:after="0"/>
+            </w:pPr>
+            <w:r>
+              <w:rPr>
+                <w:b w:val="0"/>
+                <w:color w:val="000000"/>
+                <w:sz w:val="20"/>
+              </w:rPr>
+              <w:t>Lectura local de texto y tablas</w:t>
+            </w:r>
+          </w:p>
+        </w:tc>
+        <w:tc>
+          <w:tcPr>
+            <w:tcW w:type="dxa" w:w="2484"/>
+            <w:vAlign w:val="center"/>
+            <w:shd w:fill="EAF2F7"/>
+            <w:tcMar>
+              <w:top w:w="90" w:type="dxa"/>
+              <w:bottom w:w="90" w:type="dxa"/>
+              <w:left w:w="110" w:type="dxa"/>
+              <w:right w:w="110" w:type="dxa"/>
+            </w:tcMar>
+          </w:tcPr>
+          <w:p>
+            <w:pPr>
+              <w:spacing w:after="0"/>
+            </w:pPr>
+            <w:r>
+              <w:rPr>
+                <w:b w:val="0"/>
+                <w:color w:val="000000"/>
+                <w:sz w:val="20"/>
+              </w:rPr>
+              <w:t>No por defecto</w:t>
+            </w:r>
+          </w:p>
+        </w:tc>
+        <w:tc>
+          <w:tcPr>
+            <w:tcW w:type="dxa" w:w="2484"/>
+            <w:vAlign w:val="center"/>
+            <w:shd w:fill="EAF2F7"/>
+            <w:tcMar>
+              <w:top w:w="90" w:type="dxa"/>
+              <w:bottom w:w="90" w:type="dxa"/>
+              <w:left w:w="110" w:type="dxa"/>
+              <w:right w:w="110" w:type="dxa"/>
+            </w:tcMar>
+          </w:tcPr>
+          <w:p>
+            <w:pPr>
+              <w:spacing w:after="0"/>
+            </w:pPr>
+            <w:r>
+              <w:rPr>
+                <w:b w:val="0"/>
+                <w:color w:val="000000"/>
+                <w:sz w:val="20"/>
+              </w:rPr>
+              <w:t>Firma ZIP Office, estructura, rutas y tamaño</w:t>
             </w:r>
           </w:p>
         </w:tc>
@@ -2598,12 +3424,15 @@
         <w:pStyle w:val="Heading1"/>
       </w:pPr>
       <w:r>
+        <w:rPr>
+          <w:color w:val="000000"/>
+        </w:rPr>
         <w:t>Administración de usuarios</w:t>
       </w:r>
     </w:p>
     <w:p>
       <w:r>
-        <w:t>En la PC servidor, abrir http://127.0.0.1:3000 y entrar en Usuarios. La pestaña y sus endpoints solo aceptan solicitudes cuyo origen real y encabezado Host sean de loopback.</w:t>
+        <w:t>En el servidor abrir https://127.0.0.1:3000. La pestaña Usuarios es la tercera, junto a Subir Archivos y Resultados. Solo se permite desde un origen y una conexión de loopback. Si falta, verificar https://127.0.0.1:8000/auth/me: debe mostrar local_admin: true y Administrador local; recargar con Ctrl + F5 y confirmar que el repo esté actualizado.</w:t>
       </w:r>
     </w:p>
     <w:p>
@@ -2611,6 +3440,9 @@
         <w:pStyle w:val="Heading2"/>
       </w:pPr>
       <w:r>
+        <w:rPr>
+          <w:color w:val="000000"/>
+        </w:rPr>
         <w:t>Crear un usuario</w:t>
       </w:r>
     </w:p>
@@ -2655,6 +3487,9 @@
         <w:pStyle w:val="Heading2"/>
       </w:pPr>
       <w:r>
+        <w:rPr>
+          <w:color w:val="000000"/>
+        </w:rPr>
         <w:t>Modificar un usuario</w:t>
       </w:r>
     </w:p>
@@ -2690,6 +3525,9 @@
         <w:pStyle w:val="Heading2"/>
       </w:pPr>
       <w:r>
+        <w:rPr>
+          <w:color w:val="000000"/>
+        </w:rPr>
         <w:t>Deshabilitar o eliminar un usuario</w:t>
       </w:r>
     </w:p>
@@ -2722,6 +3560,9 @@
         <w:pStyle w:val="Heading1"/>
       </w:pPr>
       <w:r>
+        <w:rPr>
+          <w:color w:val="000000"/>
+        </w:rPr>
         <w:t>Gestión de tokens cuentas y créditos</w:t>
       </w:r>
     </w:p>
@@ -2730,6 +3571,9 @@
         <w:pStyle w:val="Heading2"/>
       </w:pPr>
       <w:r>
+        <w:rPr>
+          <w:color w:val="000000"/>
+        </w:rPr>
         <w:t>Clave de Anthropic</w:t>
       </w:r>
     </w:p>
@@ -2788,6 +3632,9 @@
         <w:pStyle w:val="Heading2"/>
       </w:pPr>
       <w:r>
+        <w:rPr>
+          <w:color w:val="000000"/>
+        </w:rPr>
         <w:t>Compra y control de créditos</w:t>
       </w:r>
     </w:p>
@@ -2837,6 +3684,9 @@
         <w:pStyle w:val="Heading2"/>
       </w:pPr>
       <w:r>
+        <w:rPr>
+          <w:color w:val="000000"/>
+        </w:rPr>
         <w:t>Correo Gmail para confirmaciones</w:t>
       </w:r>
     </w:p>
@@ -2881,6 +3731,9 @@
         <w:pStyle w:val="Heading1"/>
       </w:pPr>
       <w:r>
+        <w:rPr>
+          <w:color w:val="000000"/>
+        </w:rPr>
         <w:t>Archivos de configuración y secretos</w:t>
       </w:r>
     </w:p>
@@ -3519,6 +4372,9 @@
         <w:pStyle w:val="Heading1"/>
       </w:pPr>
       <w:r>
+        <w:rPr>
+          <w:color w:val="000000"/>
+        </w:rPr>
         <w:t>Actualización del sistema</w:t>
       </w:r>
     </w:p>
@@ -3573,7 +4429,7 @@
         <w:ind w:left="403" w:hanging="403"/>
       </w:pPr>
       <w:r>
-        <w:t>6. Iniciar con iniciar-servidor.bat y completar la lista de verificación posterior.</w:t>
+        <w:t>6. Iniciar con C:\ProgramData\PriceBotTLS\INICIAR-PRICEBOT-SEGURO.bat y completar la lista de verificación posterior. Si se actualizó el instalador cliente, preparar y distribuir el acceso nuevo sin regenerar la CA.</w:t>
       </w:r>
     </w:p>
     <w:p>
@@ -3581,6 +4437,9 @@
         <w:pStyle w:val="Heading1"/>
       </w:pPr>
       <w:r>
+        <w:rPr>
+          <w:color w:val="000000"/>
+        </w:rPr>
         <w:t>Controles de seguridad implementados</w:t>
       </w:r>
     </w:p>
@@ -4226,6 +5085,9 @@
         <w:pStyle w:val="Heading1"/>
       </w:pPr>
       <w:r>
+        <w:rPr>
+          <w:color w:val="000000"/>
+        </w:rPr>
         <w:t>Riesgos pendientes y mejoras recomendadas</w:t>
       </w:r>
     </w:p>
@@ -4274,6 +5136,9 @@
         <w:pStyle w:val="Heading1"/>
       </w:pPr>
       <w:r>
+        <w:rPr>
+          <w:color w:val="000000"/>
+        </w:rPr>
         <w:t>Respuesta ante incidentes</w:t>
       </w:r>
     </w:p>
@@ -4333,17 +5198,71 @@
     </w:p>
     <w:p>
       <w:pPr>
+        <w:pStyle w:val="Heading2"/>
+      </w:pPr>
+      <w:r>
+        <w:rPr>
+          <w:color w:val="000000"/>
+        </w:rPr>
+        <w:t>Cambios documentados en esta edición</w:t>
+      </w:r>
+    </w:p>
+    <w:p>
+      <w:pPr>
+        <w:pStyle w:val="ListBullet"/>
+      </w:pPr>
+      <w:r>
+        <w:t>HTTPS obligatorio en la LAN, certificado para IP y localhost y arranque protegido frente a procesos HTTP anteriores.</w:t>
+      </w:r>
+    </w:p>
+    <w:p>
+      <w:pPr>
+        <w:pStyle w:val="ListBullet"/>
+      </w:pPr>
+      <w:r>
+        <w:t>API local con el mismo protocolo que el frontend, orígenes HTTPS previstos y administración de usuarios solo desde loopback.</w:t>
+      </w:r>
+    </w:p>
+    <w:p>
+      <w:pPr>
+        <w:pStyle w:val="ListBullet"/>
+      </w:pPr>
+      <w:r>
+        <w:t>Confianza por usuario Windows sin permisos de administrador, más alternativa de confianza para toda la PC con TI.</w:t>
+      </w:r>
+    </w:p>
+    <w:p>
+      <w:pPr>
+        <w:pStyle w:val="ListBullet"/>
+      </w:pPr>
+      <w:r>
+        <w:t>Archivo de acceso independiente con CA pública y huella incorporadas, comprobación automática y generación de paquetes sin renovar certificados.</w:t>
+      </w:r>
+    </w:p>
+    <w:p>
+      <w:pPr>
+        <w:pStyle w:val="ListBullet"/>
+      </w:pPr>
+      <w:r>
+        <w:t>Detalles técnicos y pruebas en Documentacion\Cambios_TLS_LAN.md. No se incorporan contraseñas, claves API ni claves privadas al manual.</w:t>
+      </w:r>
+    </w:p>
+    <w:p>
+      <w:pPr>
         <w:pStyle w:val="Heading1"/>
         <w:pageBreakBefore/>
       </w:pPr>
       <w:r>
+        <w:rPr>
+          <w:color w:val="000000"/>
+        </w:rPr>
         <w:t>Lista de verificación posterior a una actualización</w:t>
       </w:r>
     </w:p>
     <w:p>
       <w:pPr>
         <w:pStyle w:val="ListBullet"/>
-        <w:spacing w:after="0" w:line="240" w:lineRule="auto"/>
+        <w:spacing w:after="60" w:line="240" w:lineRule="auto"/>
       </w:pPr>
       <w:r>
         <w:t>☐ El lanzador inicia backend y frontend sin errores.</w:t>
@@ -4352,7 +5271,7 @@
     <w:p>
       <w:pPr>
         <w:pStyle w:val="ListBullet"/>
-        <w:spacing w:after="0" w:line="240" w:lineRule="auto"/>
+        <w:spacing w:after="60" w:line="240" w:lineRule="auto"/>
       </w:pPr>
       <w:r>
         <w:t>☐ La URL local entra como Administrador local sin solicitar contraseña.</w:t>
@@ -4361,7 +5280,7 @@
     <w:p>
       <w:pPr>
         <w:pStyle w:val="ListBullet"/>
-        <w:spacing w:after="0" w:line="240" w:lineRule="auto"/>
+        <w:spacing w:after="60" w:line="240" w:lineRule="auto"/>
       </w:pPr>
       <w:r>
         <w:t>☐ La URL HTTPS abre sin alertas en cada PC y el correo de confirmación usa ese mismo nombre.</w:t>
@@ -4370,7 +5289,7 @@
     <w:p>
       <w:pPr>
         <w:pStyle w:val="ListBullet"/>
-        <w:spacing w:after="0" w:line="240" w:lineRule="auto"/>
+        <w:spacing w:after="60" w:line="240" w:lineRule="auto"/>
       </w:pPr>
       <w:r>
         <w:t>☐ Crear, modificar, deshabilitar, habilitar y eliminar usuarios funciona.</w:t>
@@ -4379,7 +5298,7 @@
     <w:p>
       <w:pPr>
         <w:pStyle w:val="ListBullet"/>
-        <w:spacing w:after="0" w:line="240" w:lineRule="auto"/>
+        <w:spacing w:after="60" w:line="240" w:lineRule="auto"/>
       </w:pPr>
       <w:r>
         <w:t>☐ Un archivo pequeño válido se procesa y descarga correctamente.</w:t>
@@ -4388,7 +5307,7 @@
     <w:p>
       <w:pPr>
         <w:pStyle w:val="ListBullet"/>
-        <w:spacing w:after="0" w:line="240" w:lineRule="auto"/>
+        <w:spacing w:after="60" w:line="240" w:lineRule="auto"/>
       </w:pPr>
       <w:r>
         <w:t>☐ Un archivo con extensión falsa o tamaño excesivo es rechazado.</w:t>
@@ -4397,7 +5316,7 @@
     <w:p>
       <w:pPr>
         <w:pStyle w:val="ListBullet"/>
-        <w:spacing w:after="0" w:line="240" w:lineRule="auto"/>
+        <w:spacing w:after="60" w:line="240" w:lineRule="auto"/>
       </w:pPr>
       <w:r>
         <w:t>☐ La salida coincide con una muestra del documento original.</w:t>
@@ -4406,7 +5325,7 @@
     <w:p>
       <w:pPr>
         <w:pStyle w:val="ListBullet"/>
-        <w:spacing w:after="0" w:line="240" w:lineRule="auto"/>
+        <w:spacing w:after="60" w:line="240" w:lineRule="auto"/>
       </w:pPr>
       <w:r>
         <w:t>☐ IA externa solo con saldo aprobado; Git sin documentos ni secretos.</w:t>
@@ -4415,6 +5334,7 @@
     <w:p>
       <w:pPr>
         <w:pStyle w:val="ListBullet"/>
+        <w:spacing w:after="60"/>
       </w:pPr>
       <w:r>
         <w:t>☐ Desde una PC autorizada, /health responde status ok por HTTPS sin advertencias.</w:t>
@@ -4423,9 +5343,18 @@
     <w:p>
       <w:pPr>
         <w:pStyle w:val="ListBullet"/>
+        <w:spacing w:after="60"/>
       </w:pPr>
       <w:r>
         <w:t>☐ Una conexión HTTP remota se rechaza; no se aceptaron excepciones del navegador.</w:t>
+      </w:r>
+    </w:p>
+    <w:p>
+      <w:pPr>
+        <w:pStyle w:val="ListBullet"/>
+      </w:pPr>
+      <w:r>
+        <w:t>☐ El archivo de acceso independiente configura el usuario Windows y verifica HTTPS sin pedir administrador.</w:t>
       </w:r>
     </w:p>
     <w:sectPr>
@@ -5172,9 +6101,6 @@
     <w:rsid w:val="00FC693F"/>
     <w:pPr>
       <w:keepNext/>
-      <w:pBdr>
-        <w:bottom w:val="single" w:sz="8" w:space="4" w:color="4F81BD" w:themeColor="accent1"/>
-      </w:pBdr>
       <w:spacing w:after="140" w:line="240" w:lineRule="auto" w:before="0"/>
       <w:contextualSpacing/>
     </w:pPr>

</xml_diff>

<commit_message>
Agrega descargas directas y pasos simples al manual
</commit_message>
<xml_diff>
--- a/Documentacion/Manual_de_Administracion_y_Operacion_PriceBot.docx
+++ b/Documentacion/Manual_de_Administracion_y_Operacion_PriceBot.docx
@@ -299,7 +299,7 @@
           </w:tcPr>
           <w:p>
             <w:r>
-              <w:t>13 de octubre de 2026 · Acceso HTTPS automático</w:t>
+              <w:t>13 de octubre de 2026 · Revisión 2 con descargas directas</w:t>
             </w:r>
           </w:p>
         </w:tc>
@@ -1225,13 +1225,25 @@
             <w:tcW w:type="dxa" w:w="3312"/>
           </w:tcPr>
           <w:p>
-            <w:hyperlink r:id="rId22">
+            <w:hyperlink r:id="rId23">
               <w:r>
                 <w:rPr>
                   <w:color w:val="0563C1"/>
                   <w:u w:val="single"/>
                 </w:rPr>
-                <w:t>Descargar el archivo de acceso</w:t>
+                <w:t>Descargar ZIP para usuarios</w:t>
+              </w:r>
+            </w:hyperlink>
+            <w:r>
+              <w:br/>
+            </w:r>
+            <w:hyperlink r:id="rId24">
+              <w:r>
+                <w:rPr>
+                  <w:color w:val="0563C1"/>
+                  <w:u w:val="single"/>
+                </w:rPr>
+                <w:t>Descargar script independiente</w:t>
               </w:r>
             </w:hyperlink>
           </w:p>
@@ -1242,7 +1254,7 @@
           </w:tcPr>
           <w:p>
             <w:r>
-              <w:t>Descargar el archivo original .bat desde GitHub o recibirlo de TI; ejecutar normalmente</w:t>
+              <w:t>Elegir una opción; guardar en Descargas y ejecutar el script con doble clic normal</w:t>
             </w:r>
           </w:p>
         </w:tc>
@@ -1734,7 +1746,7 @@
     <w:p>
       <w:pPr/>
       <w:r>
-        <w:t>2. Entregar a cada persona el archivo del repo dist\CONFIGURAR-PRICEBOT-LAN.bat, o el ZIP dist\Clientes-PriceBot-SinAdmin.zip. Una instalación nueva también genera el archivo dentro de C:\ProgramData\PriceBotTLS\Clientes y lo incluye en Clientes-PriceBot.zip.</w:t>
+        <w:t>2. Compartir los enlaces de descarga del apartado Descargar el acceso o entregar dist\CONFIGURAR-PRICEBOT-LAN.bat o dist\Clientes-PriceBot-SinAdmin.zip. Las copias de referencia están en Documentacion del repo. Una instalación nueva también los genera en C:\ProgramData\PriceBotTLS\Clientes y Clientes-PriceBot.zip.</w:t>
       </w:r>
     </w:p>
     <w:p>
@@ -1754,6 +1766,50 @@
         <w:pStyle w:val="Heading2"/>
       </w:pPr>
       <w:r>
+        <w:t>Descargar el acceso</w:t>
+      </w:r>
+    </w:p>
+    <w:p>
+      <w:pPr/>
+      <w:r>
+        <w:t>Elegir una sola opción. El ZIP es la opción recomendada: permite descargar todas las herramientas juntas. Los enlaces también están en la tabla Enlaces y puntos de acceso. En Word, usar Ctrl y clic si un clic normal no abre el enlace.</w:t>
+      </w:r>
+    </w:p>
+    <w:p>
+      <w:pPr/>
+      <w:hyperlink r:id="rId23">
+        <w:r>
+          <w:rPr>
+            <w:color w:val="0563C1"/>
+            <w:u w:val="single"/>
+          </w:rPr>
+          <w:t>Descargar ZIP para usuarios</w:t>
+        </w:r>
+      </w:hyperlink>
+    </w:p>
+    <w:p>
+      <w:pPr/>
+      <w:hyperlink r:id="rId24">
+        <w:r>
+          <w:rPr>
+            <w:color w:val="0563C1"/>
+            <w:u w:val="single"/>
+          </w:rPr>
+          <w:t>Descargar solo el script automático</w:t>
+        </w:r>
+      </w:hyperlink>
+    </w:p>
+    <w:p>
+      <w:pPr/>
+      <w:r>
+        <w:t>Guardar en Descargas. Si el enlace del script muestra texto en lugar de descargarlo, usar la opción ZIP. El script debe conservar el nombre CONFIGURAR-PRICEBOT-LAN.bat, sin agregar .txt. Si el repositorio pide iniciar sesión, usar la cuenta autorizada o solicitar el archivo a TI.</w:t>
+      </w:r>
+    </w:p>
+    <w:p>
+      <w:pPr>
+        <w:pStyle w:val="Heading2"/>
+      </w:pPr>
+      <w:r>
         <w:rPr>
           <w:color w:val="000000"/>
         </w:rPr>
@@ -1763,7 +1819,7 @@
     <w:p>
       <w:pPr/>
       <w:r>
-        <w:t>1. Recibir CONFIGURAR-PRICEBOT-LAN.bat del responsable y guardarlo en su PC. También puede extraer el ZIP cliente completo. El archivo .bat independiente funciona sin copiar otros archivos.</w:t>
+        <w:t>1. Si descargó el ZIP, abrir Descargas, hacer clic derecho en Clientes-PriceBot-SinAdmin.zip y elegir Extraer todo. Abrir la carpeta extraída y localizar CONFIGURAR-PRICEBOT-LAN.bat. No ejecutarlo dentro del ZIP. Si descargó solo el archivo .bat, no necesita extraer ni copiar otros archivos.</w:t>
       </w:r>
     </w:p>
     <w:p>

</xml_diff>

<commit_message>
Reescribe guia de usuarios con pasos simples de acceso y certificado
</commit_message>
<xml_diff>
--- a/Documentacion/Manual_de_Administracion_y_Operacion_PriceBot.docx
+++ b/Documentacion/Manual_de_Administracion_y_Operacion_PriceBot.docx
@@ -299,7 +299,7 @@
           </w:tcPr>
           <w:p>
             <w:r>
-              <w:t>13 de octubre de 2026 · Revisión 2 con descargas directas</w:t>
+              <w:t>14 de octubre de 2026 · Revisión 3 con guía simple para usuarios</w:t>
             </w:r>
           </w:p>
         </w:tc>
@@ -1746,7 +1746,7 @@
     <w:p>
       <w:pPr/>
       <w:r>
-        <w:t>2. Compartir los enlaces de descarga del apartado Descargar el acceso o entregar dist\CONFIGURAR-PRICEBOT-LAN.bat o dist\Clientes-PriceBot-SinAdmin.zip. Las copias de referencia están en Documentacion del repo. Una instalación nueva también los genera en C:\ProgramData\PriceBotTLS\Clientes y Clientes-PriceBot.zip.</w:t>
+        <w:t>2. Compartir los enlaces de descarga del apartado Guía del usuario para empezar a usar PriceBot o entregar dist\CONFIGURAR-PRICEBOT-LAN.bat o dist\Clientes-PriceBot-SinAdmin.zip. Las copias de referencia están en Documentacion del repo. Una instalación nueva también los genera en C:\ProgramData\PriceBotTLS\Clientes y Clientes-PriceBot.zip.</w:t>
       </w:r>
     </w:p>
     <w:p>
@@ -1763,20 +1763,60 @@
     </w:p>
     <w:p>
       <w:pPr>
-        <w:pStyle w:val="Heading2"/>
+        <w:pStyle w:val="Heading1"/>
+        <w:pageBreakBefore/>
       </w:pPr>
       <w:r>
-        <w:t>Descargar el acceso</w:t>
+        <w:t>Guía del usuario para empezar a usar PriceBot</w:t>
       </w:r>
     </w:p>
     <w:p>
       <w:pPr/>
       <w:r>
-        <w:t>Elegir una sola opción. El ZIP es la opción recomendada: permite descargar todas las herramientas juntas. Los enlaces también están en la tabla Enlaces y puntos de acceso. En Word, usar Ctrl y clic si un clic normal no abre el enlace.</w:t>
+        <w:t>Seguí estos pasos desde la computadora en la que vas a trabajar. La instalación del certificado se hace una sola vez para tu usuario de Windows. Sirve para que el navegador reconozca la conexión segura con PriceBot; no crea tu cuenta ni reemplaza tu contraseña.</w:t>
+      </w:r>
+    </w:p>
+    <w:p>
+      <w:pPr>
+        <w:pStyle w:val="Heading2"/>
+      </w:pPr>
+      <w:r>
+        <w:t>Paso 1 Pedí tu cuenta a Administración</w:t>
       </w:r>
     </w:p>
     <w:p>
       <w:pPr/>
+      <w:r>
+        <w:t>Indicá el correo con el que vas a ingresar. Administración debe crear tu cuenta y enviarte un correo de confirmación. Pedí que te comuniquen tu contraseña por el medio privado autorizado por la empresa. No uses la contraseña de Gmail. Si ya tenés una cuenta, no hace falta crear otra.</w:t>
+      </w:r>
+    </w:p>
+    <w:p>
+      <w:pPr>
+        <w:pStyle w:val="Heading2"/>
+      </w:pPr>
+      <w:r>
+        <w:t>Paso 2 Conectate a la red de la empresa</w:t>
+      </w:r>
+    </w:p>
+    <w:p>
+      <w:pPr/>
+      <w:r>
+        <w:t>Usá una computadora conectada a la red de la oficina y entrá a Windows con tu usuario habitual. La computadora servidor debe estar encendida y PriceBot debe estar abierto. Desde una conexión externa, como los datos del celular, este acceso no funciona por sí solo.</w:t>
+      </w:r>
+    </w:p>
+    <w:p>
+      <w:pPr>
+        <w:pStyle w:val="Heading2"/>
+      </w:pPr>
+      <w:r>
+        <w:t>Paso 3 Descargá el archivo de instalación</w:t>
+      </w:r>
+    </w:p>
+    <w:p>
+      <w:pPr/>
+      <w:r>
+        <w:t xml:space="preserve">Hacé clic en este enlace: </w:t>
+      </w:r>
       <w:hyperlink r:id="rId23">
         <w:r>
           <w:rPr>
@@ -1789,20 +1829,8 @@
     </w:p>
     <w:p>
       <w:pPr/>
-      <w:hyperlink r:id="rId24">
-        <w:r>
-          <w:rPr>
-            <w:color w:val="0563C1"/>
-            <w:u w:val="single"/>
-          </w:rPr>
-          <w:t>Descargar solo el script automático</w:t>
-        </w:r>
-      </w:hyperlink>
-    </w:p>
-    <w:p>
-      <w:pPr/>
       <w:r>
-        <w:t>Guardar en Descargas. Si el enlace del script muestra texto en lugar de descargarlo, usar la opción ZIP. El script debe conservar el nombre CONFIGURAR-PRICEBOT-LAN.bat, sin agregar .txt. Si el repositorio pide iniciar sesión, usar la cuenta autorizada o solicitar el archivo a TI.</w:t>
+        <w:t>Si estás leyendo el manual en Word, mantené presionada Ctrl mientras hacés clic. Guardá el archivo en Descargas. Si no podés descargarlo, pedile a Administración o a Soporte que te entregue el mismo ZIP. Usá solamente el archivo de este enlace o el que te entregue el responsable.</w:t>
       </w:r>
     </w:p>
     <w:p>
@@ -1810,46 +1838,145 @@
         <w:pStyle w:val="Heading2"/>
       </w:pPr>
       <w:r>
-        <w:rPr>
-          <w:color w:val="000000"/>
-        </w:rPr>
-        <w:t>Pasos de cada usuario en su computadora</w:t>
+        <w:t>Paso 4 Abrí la carpeta descargada</w:t>
       </w:r>
     </w:p>
     <w:p>
       <w:pPr/>
       <w:r>
-        <w:t>1. Si descargó el ZIP, abrir Descargas, hacer clic derecho en Clientes-PriceBot-SinAdmin.zip y elegir Extraer todo. Abrir la carpeta extraída y localizar CONFIGURAR-PRICEBOT-LAN.bat. No ejecutarlo dentro del ZIP. Si descargó solo el archivo .bat, no necesita extraer ni copiar otros archivos.</w:t>
+        <w:t>Abrí Descargas. Buscá Clientes-PriceBot-SinAdmin.zip, hacé clic derecho y elegí Extraer todo. Luego hacé clic en Extraer y abrí la carpeta que se creó. Buscá CONFIGURAR-PRICEBOT-LAN.bat. No lo ejecutes desde el ZIP sin extraer.</w:t>
+      </w:r>
+    </w:p>
+    <w:p>
+      <w:pPr>
+        <w:pStyle w:val="Heading2"/>
+      </w:pPr>
+      <w:r>
+        <w:t>Paso 5 Instalá y comprobá el certificado</w:t>
       </w:r>
     </w:p>
     <w:p>
       <w:pPr/>
       <w:r>
-        <w:t>2. Hacer doble clic con el usuario Windows que utilizará el sistema. No elegir Ejecutar como otro usuario. El script verifica automáticamente la CA y su huella, instala confianza solo para esa sesión de usuario, comprueba sitio y API por HTTPS válido y abre PriceBot. No pide pegar la huella ni contraseña de administrador.</w:t>
+        <w:t>Hacé doble clic en CONFIGURAR-PRICEBOT-LAN.bat, como cualquier archivo. No elijas Ejecutar como administrador ni uses otra cuenta de Windows. Se abrirá una ventana: esperá a que termine. El archivo instala el certificado y comprueba la conexión automáticamente; no tenés que escribir códigos ni configurar nada.</w:t>
       </w:r>
     </w:p>
     <w:p>
       <w:pPr/>
       <w:r>
-        <w:t>3. Esperar ACCESO CONFIGURADO. Windows puede mostrar un aviso de ejecución o confianza según la política corporativa. Si la política bloquea instalar raíces, solicitar la distribución a TI; el script no cambia automáticamente al almacén de toda la PC.</w:t>
+        <w:t>Cuando aparezca ACCESO CONFIGURADO, la comprobación terminó bien. PriceBot debería abrirse en el navegador. Si aparece Presione una tecla para continuar, presioná una tecla para cerrar esa ventana. Si pide una contraseña de administrador o muestra un error, detenete y enviá el mensaje a Soporte; no cambies la seguridad de Windows.</w:t>
+      </w:r>
+    </w:p>
+    <w:p>
+      <w:pPr>
+        <w:pStyle w:val="Heading2"/>
+      </w:pPr>
+      <w:r>
+        <w:t>Paso 6 Confirmá tu correo</w:t>
       </w:r>
     </w:p>
     <w:p>
       <w:pPr/>
       <w:r>
-        <w:t>4. Abrir https://192.168.190.146:3000 e ingresar con el correo y contraseña asignados por Administración. Confirmar primero el correo mediante el enlace recibido desde una PC configurada y dentro de la LAN. La frase de la CA no se utiliza para iniciar sesión.</w:t>
+        <w:t>Abrí el correo enviado por PriceBot desde esta misma computadora y hacé clic en el enlace de confirmación. Mantenete conectado a la red de la empresa. Debería aparecer un mensaje que indica que tu correo fue confirmado y que ya podés iniciar sesión.</w:t>
       </w:r>
     </w:p>
     <w:p>
       <w:pPr/>
       <w:r>
-        <w:t>5. Si el navegador conserva ERR_CERT_AUTHORITY_INVALID, cerrarlo completamente y abrirlo de nuevo. Si se usa el navegador integrado de Codex, reiniciar Codex cuando conserve la alerta. Cada usuario Windows de una misma PC debe instalar su propia confianza, salvo que TI instale para toda la PC.</w:t>
+        <w:t>Si el correo no llegó, revisá Spam o Correo no deseado. Si no está o el enlace venció, pedile a Administración que lo reenvíe. Si ya confirmaste tu cuenta, omití este paso. Confirmar el correo no instala el certificado: primero completá el paso 5.</w:t>
+      </w:r>
+    </w:p>
+    <w:p>
+      <w:pPr>
+        <w:pStyle w:val="Heading2"/>
+      </w:pPr>
+      <w:r>
+        <w:t>Paso 7 Entrá a PriceBot</w:t>
       </w:r>
     </w:p>
     <w:p>
       <w:pPr/>
       <w:r>
-        <w:t>Alternativa manual: INSTALAR-SOLO-USUARIO.bat comprueba la huella pegada por el usuario y usa CurrentUser. INSTALAR-CLIENTE.bat requiere administrador Windows y usa LocalMachine para toda la PC. Ambas opciones mantienen la validación de certificados.</w:t>
+        <w:t xml:space="preserve">Abrí esta dirección: </w:t>
+      </w:r>
+      <w:hyperlink r:id="rId25">
+        <w:r>
+          <w:rPr>
+            <w:color w:val="0563C1"/>
+            <w:u w:val="single"/>
+          </w:rPr>
+          <w:t>https://192.168.190.146:3000/</w:t>
+        </w:r>
+      </w:hyperlink>
+    </w:p>
+    <w:p>
+      <w:pPr/>
+      <w:r>
+        <w:t>Escribí tu correo completo y la contraseña de PriceBot que te comunicó Administración. Presioná el botón para iniciar sesión. El sitio debe abrir sin avisos sobre el certificado. Podés guardar la dirección en Favoritos para usarla los próximos días.</w:t>
+      </w:r>
+    </w:p>
+    <w:p>
+      <w:pPr>
+        <w:pStyle w:val="Heading2"/>
+      </w:pPr>
+      <w:r>
+        <w:t>Paso 8 Hacé tu primera prueba</w:t>
+      </w:r>
+    </w:p>
+    <w:p>
+      <w:pPr/>
+      <w:r>
+        <w:t>Entrá a Subir Archivos y elegí un documento de prueba sin información confidencial. Completá el CUIT si corresponde e iniciá la extracción. Esperá a que termine, revisá Resultados y descargá la planilla en XLSX o XLS. Compará algunas filas con el documento original antes de usar el resultado. Al terminar, cerrá tu sesión y eliminá las copias de prueba que ya no necesites.</w:t>
+      </w:r>
+    </w:p>
+    <w:p>
+      <w:pPr>
+        <w:pStyle w:val="Heading2"/>
+      </w:pPr>
+      <w:r>
+        <w:t>Si algo no funciona</w:t>
+      </w:r>
+    </w:p>
+    <w:p>
+      <w:pPr/>
+      <w:r>
+        <w:t>Si aparece un aviso de certificado, cerrá por completo el navegador y abrilo de nuevo. Si sigue apareciendo, no elijas continuar de todos modos: avisá a Soporte. Si la página no responde, verificá que estés en la red de la empresa y consultá si el servidor está encendido. Si no podés iniciar sesión, pedile a Administración que revise tu cuenta; no compartas tu contraseña ni documentos en las capturas del error.</w:t>
+      </w:r>
+    </w:p>
+    <w:p>
+      <w:pPr>
+        <w:pStyle w:val="Heading2"/>
+      </w:pPr>
+      <w:r>
+        <w:t>Para los próximos ingresos</w:t>
+      </w:r>
+    </w:p>
+    <w:p>
+      <w:pPr/>
+      <w:r>
+        <w:t>Abrí la dirección guardada en Favoritos e ingresá con tu cuenta. No hace falta repetir la instalación ni confirmar el correo cada día. Si cambiás de computadora o de usuario de Windows, repetí la instalación del certificado. Hacelo también si Soporte te entrega una versión nueva y te indica que la instales.</w:t>
+      </w:r>
+    </w:p>
+    <w:p>
+      <w:pPr/>
+      <w:r>
+        <w:t xml:space="preserve">Alternativa si Soporte te entrega el archivo suelto: </w:t>
+      </w:r>
+      <w:hyperlink r:id="rId24">
+        <w:r>
+          <w:rPr>
+            <w:color w:val="0563C1"/>
+            <w:u w:val="single"/>
+          </w:rPr>
+          <w:t>Descargar solo CONFIGURAR-PRICEBOT-LAN.bat</w:t>
+        </w:r>
+      </w:hyperlink>
+    </w:p>
+    <w:p>
+      <w:pPr/>
+      <w:r>
+        <w:t>Ese archivo se ejecuta con doble clic y no necesita extraerse. Si el enlace muestra texto en lugar de descargar el archivo, usá el ZIP del paso 3. No cambies la extensión .bat por .txt.</w:t>
       </w:r>
     </w:p>
     <w:p>

</xml_diff>